<commit_message>
Record chi128 rate-scan progress: running: recovered after session interruption
</commit_message>
<xml_diff>
--- a/research/transition-order/chi128-scan-report.docx
+++ b/research/transition-order/chi128-scan-report.docx
@@ -50,7 +50,7 @@
           <w:b w:val="0"/>
           <w:i w:val="0"/>
         </w:rPr>
-        <w:t xml:space="preserve"> 1/6. </w:t>
+        <w:t xml:space="preserve"> 2/6. </w:t>
       </w:r>
       <w:r>
         <w:rPr>
@@ -64,7 +64,7 @@
           <w:b w:val="0"/>
           <w:i w:val="0"/>
         </w:rPr>
-        <w:t xml:space="preserve"> 0/10; the two previously accepted p=.30486 states are reused, not reoptimized.</w:t>
+        <w:t xml:space="preserve"> 2/10; the two previously accepted p=.30486 states are reused, not reoptimized.</w:t>
       </w:r>
     </w:p>
     <w:p>
@@ -167,21 +167,30 @@
         <w:gridCol w:w="1218"/>
       </w:tblGrid>
       <w:tr>
+        <w:trPr>
+          <w:cantSplit/>
+          <w:tblHeader/>
+        </w:trPr>
         <w:tc>
           <w:tcPr>
             <w:tcW w:type="dxa" w:w="1218"/>
             <w:shd w:val="clear" w:color="auto" w:fill="E8ECF2"/>
+            <w:shd w:val="clear" w:color="auto" w:fill="E6EEF5"/>
           </w:tcPr>
           <w:p>
             <w:pPr>
               <w:spacing w:after="40"/>
             </w:pPr>
-            <w:r/>
+            <w:r>
+              <w:rPr>
+                <w:sz w:val="16"/>
+              </w:rPr>
+            </w:r>
             <w:r>
               <w:rPr>
                 <w:b/>
                 <w:i w:val="0"/>
-                <w:sz w:val="18"/>
+                <w:sz w:val="16"/>
               </w:rPr>
               <w:t>p</w:t>
             </w:r>
@@ -191,17 +200,22 @@
           <w:tcPr>
             <w:tcW w:type="dxa" w:w="1218"/>
             <w:shd w:val="clear" w:color="auto" w:fill="E8ECF2"/>
+            <w:shd w:val="clear" w:color="auto" w:fill="E6EEF5"/>
           </w:tcPr>
           <w:p>
             <w:pPr>
               <w:spacing w:after="40"/>
             </w:pPr>
-            <w:r/>
+            <w:r>
+              <w:rPr>
+                <w:sz w:val="16"/>
+              </w:rPr>
+            </w:r>
             <w:r>
               <w:rPr>
                 <w:b/>
                 <w:i w:val="0"/>
-                <w:sz w:val="18"/>
+                <w:sz w:val="16"/>
               </w:rPr>
               <w:t>Preparation</w:t>
             </w:r>
@@ -211,17 +225,22 @@
           <w:tcPr>
             <w:tcW w:type="dxa" w:w="1218"/>
             <w:shd w:val="clear" w:color="auto" w:fill="E8ECF2"/>
+            <w:shd w:val="clear" w:color="auto" w:fill="E6EEF5"/>
           </w:tcPr>
           <w:p>
             <w:pPr>
               <w:spacing w:after="40"/>
             </w:pPr>
-            <w:r/>
+            <w:r>
+              <w:rPr>
+                <w:sz w:val="16"/>
+              </w:rPr>
+            </w:r>
             <w:r>
               <w:rPr>
                 <w:b/>
                 <w:i w:val="0"/>
-                <w:sz w:val="18"/>
+                <w:sz w:val="16"/>
               </w:rPr>
               <w:t>Status</w:t>
             </w:r>
@@ -231,17 +250,22 @@
           <w:tcPr>
             <w:tcW w:type="dxa" w:w="1218"/>
             <w:shd w:val="clear" w:color="auto" w:fill="E8ECF2"/>
+            <w:shd w:val="clear" w:color="auto" w:fill="E6EEF5"/>
           </w:tcPr>
           <w:p>
             <w:pPr>
               <w:spacing w:after="40"/>
             </w:pPr>
-            <w:r/>
+            <w:r>
+              <w:rPr>
+                <w:sz w:val="16"/>
+              </w:rPr>
+            </w:r>
             <w:r>
               <w:rPr>
                 <w:b/>
                 <w:i w:val="0"/>
-                <w:sz w:val="18"/>
+                <w:sz w:val="16"/>
               </w:rPr>
               <w:t>Residual</w:t>
             </w:r>
@@ -251,17 +275,22 @@
           <w:tcPr>
             <w:tcW w:type="dxa" w:w="1218"/>
             <w:shd w:val="clear" w:color="auto" w:fill="E8ECF2"/>
+            <w:shd w:val="clear" w:color="auto" w:fill="E6EEF5"/>
           </w:tcPr>
           <w:p>
             <w:pPr>
               <w:spacing w:after="40"/>
             </w:pPr>
-            <w:r/>
+            <w:r>
+              <w:rPr>
+                <w:sz w:val="16"/>
+              </w:rPr>
+            </w:r>
             <w:r>
               <w:rPr>
                 <w:b/>
                 <w:i w:val="0"/>
-                <w:sz w:val="18"/>
+                <w:sz w:val="16"/>
               </w:rPr>
               <w:t>f_period_Rayleigh</w:t>
             </w:r>
@@ -271,17 +300,22 @@
           <w:tcPr>
             <w:tcW w:type="dxa" w:w="1218"/>
             <w:shd w:val="clear" w:color="auto" w:fill="E8ECF2"/>
+            <w:shd w:val="clear" w:color="auto" w:fill="E6EEF5"/>
           </w:tcPr>
           <w:p>
             <w:pPr>
               <w:spacing w:after="40"/>
             </w:pPr>
-            <w:r/>
+            <w:r>
+              <w:rPr>
+                <w:sz w:val="16"/>
+              </w:rPr>
+            </w:r>
             <w:r>
               <w:rPr>
                 <w:b/>
                 <w:i w:val="0"/>
-                <w:sz w:val="18"/>
+                <w:sz w:val="16"/>
               </w:rPr>
               <w:t>m_species</w:t>
             </w:r>
@@ -291,17 +325,22 @@
           <w:tcPr>
             <w:tcW w:type="dxa" w:w="1218"/>
             <w:shd w:val="clear" w:color="auto" w:fill="E8ECF2"/>
+            <w:shd w:val="clear" w:color="auto" w:fill="E6EEF5"/>
           </w:tcPr>
           <w:p>
             <w:pPr>
               <w:spacing w:after="40"/>
             </w:pPr>
-            <w:r/>
+            <w:r>
+              <w:rPr>
+                <w:sz w:val="16"/>
+              </w:rPr>
+            </w:r>
             <w:r>
               <w:rPr>
                 <w:b/>
                 <w:i w:val="0"/>
-                <w:sz w:val="18"/>
+                <w:sz w:val="16"/>
               </w:rPr>
               <w:t>Color L2</w:t>
             </w:r>
@@ -311,17 +350,22 @@
           <w:tcPr>
             <w:tcW w:type="dxa" w:w="1218"/>
             <w:shd w:val="clear" w:color="auto" w:fill="E8ECF2"/>
+            <w:shd w:val="clear" w:color="auto" w:fill="E6EEF5"/>
           </w:tcPr>
           <w:p>
             <w:pPr>
               <w:spacing w:after="40"/>
             </w:pPr>
-            <w:r/>
+            <w:r>
+              <w:rPr>
+                <w:sz w:val="16"/>
+              </w:rPr>
+            </w:r>
             <w:r>
               <w:rPr>
                 <w:b/>
                 <w:i w:val="0"/>
-                <w:sz w:val="18"/>
+                <w:sz w:val="16"/>
               </w:rPr>
               <w:t>xi_chi</w:t>
             </w:r>
@@ -329,6 +373,9 @@
         </w:tc>
       </w:tr>
       <w:tr>
+        <w:trPr>
+          <w:cantSplit/>
+        </w:trPr>
         <w:tc>
           <w:tcPr>
             <w:tcW w:type="dxa" w:w="1218"/>
@@ -337,12 +384,16 @@
             <w:pPr>
               <w:spacing w:after="40"/>
             </w:pPr>
-            <w:r/>
+            <w:r>
+              <w:rPr>
+                <w:sz w:val="16"/>
+              </w:rPr>
+            </w:r>
             <w:r>
               <w:rPr>
                 <w:b w:val="0"/>
                 <w:i w:val="0"/>
-                <w:sz w:val="18"/>
+                <w:sz w:val="16"/>
               </w:rPr>
               <w:t>0.3040000</w:t>
             </w:r>
@@ -356,12 +407,16 @@
             <w:pPr>
               <w:spacing w:after="40"/>
             </w:pPr>
-            <w:r/>
+            <w:r>
+              <w:rPr>
+                <w:sz w:val="16"/>
+              </w:rPr>
+            </w:r>
             <w:r>
               <w:rPr>
                 <w:b w:val="0"/>
                 <w:i w:val="0"/>
-                <w:sz w:val="18"/>
+                <w:sz w:val="16"/>
               </w:rPr>
               <w:t>ordered</w:t>
             </w:r>
@@ -375,12 +430,16 @@
             <w:pPr>
               <w:spacing w:after="40"/>
             </w:pPr>
-            <w:r/>
+            <w:r>
+              <w:rPr>
+                <w:sz w:val="16"/>
+              </w:rPr>
+            </w:r>
             <w:r>
               <w:rPr>
                 <w:b w:val="0"/>
                 <w:i w:val="0"/>
-                <w:sz w:val="18"/>
+                <w:sz w:val="16"/>
               </w:rPr>
               <w:t>pending</w:t>
             </w:r>
@@ -394,12 +453,16 @@
             <w:pPr>
               <w:spacing w:after="40"/>
             </w:pPr>
-            <w:r/>
+            <w:r>
+              <w:rPr>
+                <w:sz w:val="16"/>
+              </w:rPr>
+            </w:r>
             <w:r>
               <w:rPr>
                 <w:b w:val="0"/>
                 <w:i w:val="0"/>
-                <w:sz w:val="18"/>
+                <w:sz w:val="16"/>
               </w:rPr>
               <w:t>—</w:t>
             </w:r>
@@ -413,12 +476,16 @@
             <w:pPr>
               <w:spacing w:after="40"/>
             </w:pPr>
-            <w:r/>
+            <w:r>
+              <w:rPr>
+                <w:sz w:val="16"/>
+              </w:rPr>
+            </w:r>
             <w:r>
               <w:rPr>
                 <w:b w:val="0"/>
                 <w:i w:val="0"/>
-                <w:sz w:val="18"/>
+                <w:sz w:val="16"/>
               </w:rPr>
               <w:t>—</w:t>
             </w:r>
@@ -432,12 +499,16 @@
             <w:pPr>
               <w:spacing w:after="40"/>
             </w:pPr>
-            <w:r/>
+            <w:r>
+              <w:rPr>
+                <w:sz w:val="16"/>
+              </w:rPr>
+            </w:r>
             <w:r>
               <w:rPr>
                 <w:b w:val="0"/>
                 <w:i w:val="0"/>
-                <w:sz w:val="18"/>
+                <w:sz w:val="16"/>
               </w:rPr>
               <w:t>—</w:t>
             </w:r>
@@ -451,12 +522,16 @@
             <w:pPr>
               <w:spacing w:after="40"/>
             </w:pPr>
-            <w:r/>
+            <w:r>
+              <w:rPr>
+                <w:sz w:val="16"/>
+              </w:rPr>
+            </w:r>
             <w:r>
               <w:rPr>
                 <w:b w:val="0"/>
                 <w:i w:val="0"/>
-                <w:sz w:val="18"/>
+                <w:sz w:val="16"/>
               </w:rPr>
               <w:t>—</w:t>
             </w:r>
@@ -470,12 +545,16 @@
             <w:pPr>
               <w:spacing w:after="40"/>
             </w:pPr>
-            <w:r/>
+            <w:r>
+              <w:rPr>
+                <w:sz w:val="16"/>
+              </w:rPr>
+            </w:r>
             <w:r>
               <w:rPr>
                 <w:b w:val="0"/>
                 <w:i w:val="0"/>
-                <w:sz w:val="18"/>
+                <w:sz w:val="16"/>
               </w:rPr>
               <w:t>—</w:t>
             </w:r>
@@ -483,6 +562,206 @@
         </w:tc>
       </w:tr>
       <w:tr>
+        <w:trPr>
+          <w:cantSplit/>
+        </w:trPr>
+        <w:tc>
+          <w:tcPr>
+            <w:tcW w:type="dxa" w:w="1218"/>
+            <w:shd w:val="clear" w:color="auto" w:fill="F5F7FA"/>
+          </w:tcPr>
+          <w:p>
+            <w:pPr>
+              <w:spacing w:after="40"/>
+            </w:pPr>
+            <w:r>
+              <w:rPr>
+                <w:sz w:val="16"/>
+              </w:rPr>
+            </w:r>
+            <w:r>
+              <w:rPr>
+                <w:b w:val="0"/>
+                <w:i w:val="0"/>
+                <w:sz w:val="16"/>
+              </w:rPr>
+              <w:t>0.3040000</w:t>
+            </w:r>
+          </w:p>
+        </w:tc>
+        <w:tc>
+          <w:tcPr>
+            <w:tcW w:type="dxa" w:w="1218"/>
+            <w:shd w:val="clear" w:color="auto" w:fill="F5F7FA"/>
+          </w:tcPr>
+          <w:p>
+            <w:pPr>
+              <w:spacing w:after="40"/>
+            </w:pPr>
+            <w:r>
+              <w:rPr>
+                <w:sz w:val="16"/>
+              </w:rPr>
+            </w:r>
+            <w:r>
+              <w:rPr>
+                <w:b w:val="0"/>
+                <w:i w:val="0"/>
+                <w:sz w:val="16"/>
+              </w:rPr>
+              <w:t>disordered</w:t>
+            </w:r>
+          </w:p>
+        </w:tc>
+        <w:tc>
+          <w:tcPr>
+            <w:tcW w:type="dxa" w:w="1218"/>
+            <w:shd w:val="clear" w:color="auto" w:fill="F5F7FA"/>
+          </w:tcPr>
+          <w:p>
+            <w:pPr>
+              <w:spacing w:after="40"/>
+            </w:pPr>
+            <w:r>
+              <w:rPr>
+                <w:sz w:val="16"/>
+              </w:rPr>
+            </w:r>
+            <w:r>
+              <w:rPr>
+                <w:b w:val="0"/>
+                <w:i w:val="0"/>
+                <w:sz w:val="16"/>
+              </w:rPr>
+              <w:t>pending</w:t>
+            </w:r>
+          </w:p>
+        </w:tc>
+        <w:tc>
+          <w:tcPr>
+            <w:tcW w:type="dxa" w:w="1218"/>
+            <w:shd w:val="clear" w:color="auto" w:fill="F5F7FA"/>
+          </w:tcPr>
+          <w:p>
+            <w:pPr>
+              <w:spacing w:after="40"/>
+            </w:pPr>
+            <w:r>
+              <w:rPr>
+                <w:sz w:val="16"/>
+              </w:rPr>
+            </w:r>
+            <w:r>
+              <w:rPr>
+                <w:b w:val="0"/>
+                <w:i w:val="0"/>
+                <w:sz w:val="16"/>
+              </w:rPr>
+              <w:t>—</w:t>
+            </w:r>
+          </w:p>
+        </w:tc>
+        <w:tc>
+          <w:tcPr>
+            <w:tcW w:type="dxa" w:w="1218"/>
+            <w:shd w:val="clear" w:color="auto" w:fill="F5F7FA"/>
+          </w:tcPr>
+          <w:p>
+            <w:pPr>
+              <w:spacing w:after="40"/>
+            </w:pPr>
+            <w:r>
+              <w:rPr>
+                <w:sz w:val="16"/>
+              </w:rPr>
+            </w:r>
+            <w:r>
+              <w:rPr>
+                <w:b w:val="0"/>
+                <w:i w:val="0"/>
+                <w:sz w:val="16"/>
+              </w:rPr>
+              <w:t>—</w:t>
+            </w:r>
+          </w:p>
+        </w:tc>
+        <w:tc>
+          <w:tcPr>
+            <w:tcW w:type="dxa" w:w="1218"/>
+            <w:shd w:val="clear" w:color="auto" w:fill="F5F7FA"/>
+          </w:tcPr>
+          <w:p>
+            <w:pPr>
+              <w:spacing w:after="40"/>
+            </w:pPr>
+            <w:r>
+              <w:rPr>
+                <w:sz w:val="16"/>
+              </w:rPr>
+            </w:r>
+            <w:r>
+              <w:rPr>
+                <w:b w:val="0"/>
+                <w:i w:val="0"/>
+                <w:sz w:val="16"/>
+              </w:rPr>
+              <w:t>—</w:t>
+            </w:r>
+          </w:p>
+        </w:tc>
+        <w:tc>
+          <w:tcPr>
+            <w:tcW w:type="dxa" w:w="1218"/>
+            <w:shd w:val="clear" w:color="auto" w:fill="F5F7FA"/>
+          </w:tcPr>
+          <w:p>
+            <w:pPr>
+              <w:spacing w:after="40"/>
+            </w:pPr>
+            <w:r>
+              <w:rPr>
+                <w:sz w:val="16"/>
+              </w:rPr>
+            </w:r>
+            <w:r>
+              <w:rPr>
+                <w:b w:val="0"/>
+                <w:i w:val="0"/>
+                <w:sz w:val="16"/>
+              </w:rPr>
+              <w:t>—</w:t>
+            </w:r>
+          </w:p>
+        </w:tc>
+        <w:tc>
+          <w:tcPr>
+            <w:tcW w:type="dxa" w:w="1218"/>
+            <w:shd w:val="clear" w:color="auto" w:fill="F5F7FA"/>
+          </w:tcPr>
+          <w:p>
+            <w:pPr>
+              <w:spacing w:after="40"/>
+            </w:pPr>
+            <w:r>
+              <w:rPr>
+                <w:sz w:val="16"/>
+              </w:rPr>
+            </w:r>
+            <w:r>
+              <w:rPr>
+                <w:b w:val="0"/>
+                <w:i w:val="0"/>
+                <w:sz w:val="16"/>
+              </w:rPr>
+              <w:t>—</w:t>
+            </w:r>
+          </w:p>
+        </w:tc>
+      </w:tr>
+      <w:tr>
+        <w:trPr>
+          <w:cantSplit/>
+        </w:trPr>
         <w:tc>
           <w:tcPr>
             <w:tcW w:type="dxa" w:w="1218"/>
@@ -491,14 +770,18 @@
             <w:pPr>
               <w:spacing w:after="40"/>
             </w:pPr>
-            <w:r/>
+            <w:r>
+              <w:rPr>
+                <w:sz w:val="16"/>
+              </w:rPr>
+            </w:r>
             <w:r>
               <w:rPr>
                 <w:b w:val="0"/>
                 <w:i w:val="0"/>
-                <w:sz w:val="18"/>
+                <w:sz w:val="16"/>
               </w:rPr>
-              <w:t>0.3040000</w:t>
+              <w:t>0.3045000</w:t>
             </w:r>
           </w:p>
         </w:tc>
@@ -510,14 +793,18 @@
             <w:pPr>
               <w:spacing w:after="40"/>
             </w:pPr>
-            <w:r/>
+            <w:r>
+              <w:rPr>
+                <w:sz w:val="16"/>
+              </w:rPr>
+            </w:r>
             <w:r>
               <w:rPr>
                 <w:b w:val="0"/>
                 <w:i w:val="0"/>
-                <w:sz w:val="18"/>
+                <w:sz w:val="16"/>
               </w:rPr>
-              <w:t>disordered</w:t>
+              <w:t>ordered</w:t>
             </w:r>
           </w:p>
         </w:tc>
@@ -529,12 +816,16 @@
             <w:pPr>
               <w:spacing w:after="40"/>
             </w:pPr>
-            <w:r/>
+            <w:r>
+              <w:rPr>
+                <w:sz w:val="16"/>
+              </w:rPr>
+            </w:r>
             <w:r>
               <w:rPr>
                 <w:b w:val="0"/>
                 <w:i w:val="0"/>
-                <w:sz w:val="18"/>
+                <w:sz w:val="16"/>
               </w:rPr>
               <w:t>pending</w:t>
             </w:r>
@@ -548,12 +839,16 @@
             <w:pPr>
               <w:spacing w:after="40"/>
             </w:pPr>
-            <w:r/>
+            <w:r>
+              <w:rPr>
+                <w:sz w:val="16"/>
+              </w:rPr>
+            </w:r>
             <w:r>
               <w:rPr>
                 <w:b w:val="0"/>
                 <w:i w:val="0"/>
-                <w:sz w:val="18"/>
+                <w:sz w:val="16"/>
               </w:rPr>
               <w:t>—</w:t>
             </w:r>
@@ -567,12 +862,16 @@
             <w:pPr>
               <w:spacing w:after="40"/>
             </w:pPr>
-            <w:r/>
+            <w:r>
+              <w:rPr>
+                <w:sz w:val="16"/>
+              </w:rPr>
+            </w:r>
             <w:r>
               <w:rPr>
                 <w:b w:val="0"/>
                 <w:i w:val="0"/>
-                <w:sz w:val="18"/>
+                <w:sz w:val="16"/>
               </w:rPr>
               <w:t>—</w:t>
             </w:r>
@@ -586,12 +885,16 @@
             <w:pPr>
               <w:spacing w:after="40"/>
             </w:pPr>
-            <w:r/>
+            <w:r>
+              <w:rPr>
+                <w:sz w:val="16"/>
+              </w:rPr>
+            </w:r>
             <w:r>
               <w:rPr>
                 <w:b w:val="0"/>
                 <w:i w:val="0"/>
-                <w:sz w:val="18"/>
+                <w:sz w:val="16"/>
               </w:rPr>
               <w:t>—</w:t>
             </w:r>
@@ -605,12 +908,16 @@
             <w:pPr>
               <w:spacing w:after="40"/>
             </w:pPr>
-            <w:r/>
+            <w:r>
+              <w:rPr>
+                <w:sz w:val="16"/>
+              </w:rPr>
+            </w:r>
             <w:r>
               <w:rPr>
                 <w:b w:val="0"/>
                 <w:i w:val="0"/>
-                <w:sz w:val="18"/>
+                <w:sz w:val="16"/>
               </w:rPr>
               <w:t>—</w:t>
             </w:r>
@@ -624,12 +931,16 @@
             <w:pPr>
               <w:spacing w:after="40"/>
             </w:pPr>
-            <w:r/>
+            <w:r>
+              <w:rPr>
+                <w:sz w:val="16"/>
+              </w:rPr>
+            </w:r>
             <w:r>
               <w:rPr>
                 <w:b w:val="0"/>
                 <w:i w:val="0"/>
-                <w:sz w:val="18"/>
+                <w:sz w:val="16"/>
               </w:rPr>
               <w:t>—</w:t>
             </w:r>
@@ -637,6 +948,206 @@
         </w:tc>
       </w:tr>
       <w:tr>
+        <w:trPr>
+          <w:cantSplit/>
+        </w:trPr>
+        <w:tc>
+          <w:tcPr>
+            <w:tcW w:type="dxa" w:w="1218"/>
+            <w:shd w:val="clear" w:color="auto" w:fill="F5F7FA"/>
+          </w:tcPr>
+          <w:p>
+            <w:pPr>
+              <w:spacing w:after="40"/>
+            </w:pPr>
+            <w:r>
+              <w:rPr>
+                <w:sz w:val="16"/>
+              </w:rPr>
+            </w:r>
+            <w:r>
+              <w:rPr>
+                <w:b w:val="0"/>
+                <w:i w:val="0"/>
+                <w:sz w:val="16"/>
+              </w:rPr>
+              <w:t>0.3045000</w:t>
+            </w:r>
+          </w:p>
+        </w:tc>
+        <w:tc>
+          <w:tcPr>
+            <w:tcW w:type="dxa" w:w="1218"/>
+            <w:shd w:val="clear" w:color="auto" w:fill="F5F7FA"/>
+          </w:tcPr>
+          <w:p>
+            <w:pPr>
+              <w:spacing w:after="40"/>
+            </w:pPr>
+            <w:r>
+              <w:rPr>
+                <w:sz w:val="16"/>
+              </w:rPr>
+            </w:r>
+            <w:r>
+              <w:rPr>
+                <w:b w:val="0"/>
+                <w:i w:val="0"/>
+                <w:sz w:val="16"/>
+              </w:rPr>
+              <w:t>disordered</w:t>
+            </w:r>
+          </w:p>
+        </w:tc>
+        <w:tc>
+          <w:tcPr>
+            <w:tcW w:type="dxa" w:w="1218"/>
+            <w:shd w:val="clear" w:color="auto" w:fill="F5F7FA"/>
+          </w:tcPr>
+          <w:p>
+            <w:pPr>
+              <w:spacing w:after="40"/>
+            </w:pPr>
+            <w:r>
+              <w:rPr>
+                <w:sz w:val="16"/>
+              </w:rPr>
+            </w:r>
+            <w:r>
+              <w:rPr>
+                <w:b w:val="0"/>
+                <w:i w:val="0"/>
+                <w:sz w:val="16"/>
+              </w:rPr>
+              <w:t>pending</w:t>
+            </w:r>
+          </w:p>
+        </w:tc>
+        <w:tc>
+          <w:tcPr>
+            <w:tcW w:type="dxa" w:w="1218"/>
+            <w:shd w:val="clear" w:color="auto" w:fill="F5F7FA"/>
+          </w:tcPr>
+          <w:p>
+            <w:pPr>
+              <w:spacing w:after="40"/>
+            </w:pPr>
+            <w:r>
+              <w:rPr>
+                <w:sz w:val="16"/>
+              </w:rPr>
+            </w:r>
+            <w:r>
+              <w:rPr>
+                <w:b w:val="0"/>
+                <w:i w:val="0"/>
+                <w:sz w:val="16"/>
+              </w:rPr>
+              <w:t>—</w:t>
+            </w:r>
+          </w:p>
+        </w:tc>
+        <w:tc>
+          <w:tcPr>
+            <w:tcW w:type="dxa" w:w="1218"/>
+            <w:shd w:val="clear" w:color="auto" w:fill="F5F7FA"/>
+          </w:tcPr>
+          <w:p>
+            <w:pPr>
+              <w:spacing w:after="40"/>
+            </w:pPr>
+            <w:r>
+              <w:rPr>
+                <w:sz w:val="16"/>
+              </w:rPr>
+            </w:r>
+            <w:r>
+              <w:rPr>
+                <w:b w:val="0"/>
+                <w:i w:val="0"/>
+                <w:sz w:val="16"/>
+              </w:rPr>
+              <w:t>—</w:t>
+            </w:r>
+          </w:p>
+        </w:tc>
+        <w:tc>
+          <w:tcPr>
+            <w:tcW w:type="dxa" w:w="1218"/>
+            <w:shd w:val="clear" w:color="auto" w:fill="F5F7FA"/>
+          </w:tcPr>
+          <w:p>
+            <w:pPr>
+              <w:spacing w:after="40"/>
+            </w:pPr>
+            <w:r>
+              <w:rPr>
+                <w:sz w:val="16"/>
+              </w:rPr>
+            </w:r>
+            <w:r>
+              <w:rPr>
+                <w:b w:val="0"/>
+                <w:i w:val="0"/>
+                <w:sz w:val="16"/>
+              </w:rPr>
+              <w:t>—</w:t>
+            </w:r>
+          </w:p>
+        </w:tc>
+        <w:tc>
+          <w:tcPr>
+            <w:tcW w:type="dxa" w:w="1218"/>
+            <w:shd w:val="clear" w:color="auto" w:fill="F5F7FA"/>
+          </w:tcPr>
+          <w:p>
+            <w:pPr>
+              <w:spacing w:after="40"/>
+            </w:pPr>
+            <w:r>
+              <w:rPr>
+                <w:sz w:val="16"/>
+              </w:rPr>
+            </w:r>
+            <w:r>
+              <w:rPr>
+                <w:b w:val="0"/>
+                <w:i w:val="0"/>
+                <w:sz w:val="16"/>
+              </w:rPr>
+              <w:t>—</w:t>
+            </w:r>
+          </w:p>
+        </w:tc>
+        <w:tc>
+          <w:tcPr>
+            <w:tcW w:type="dxa" w:w="1218"/>
+            <w:shd w:val="clear" w:color="auto" w:fill="F5F7FA"/>
+          </w:tcPr>
+          <w:p>
+            <w:pPr>
+              <w:spacing w:after="40"/>
+            </w:pPr>
+            <w:r>
+              <w:rPr>
+                <w:sz w:val="16"/>
+              </w:rPr>
+            </w:r>
+            <w:r>
+              <w:rPr>
+                <w:b w:val="0"/>
+                <w:i w:val="0"/>
+                <w:sz w:val="16"/>
+              </w:rPr>
+              <w:t>—</w:t>
+            </w:r>
+          </w:p>
+        </w:tc>
+      </w:tr>
+      <w:tr>
+        <w:trPr>
+          <w:cantSplit/>
+        </w:trPr>
         <w:tc>
           <w:tcPr>
             <w:tcW w:type="dxa" w:w="1218"/>
@@ -645,14 +1156,18 @@
             <w:pPr>
               <w:spacing w:after="40"/>
             </w:pPr>
-            <w:r/>
+            <w:r>
+              <w:rPr>
+                <w:sz w:val="16"/>
+              </w:rPr>
+            </w:r>
             <w:r>
               <w:rPr>
                 <w:b w:val="0"/>
                 <w:i w:val="0"/>
-                <w:sz w:val="18"/>
+                <w:sz w:val="16"/>
               </w:rPr>
-              <w:t>0.3045000</w:t>
+              <w:t>0.3047000</w:t>
             </w:r>
           </w:p>
         </w:tc>
@@ -664,12 +1179,16 @@
             <w:pPr>
               <w:spacing w:after="40"/>
             </w:pPr>
-            <w:r/>
+            <w:r>
+              <w:rPr>
+                <w:sz w:val="16"/>
+              </w:rPr>
+            </w:r>
             <w:r>
               <w:rPr>
                 <w:b w:val="0"/>
                 <w:i w:val="0"/>
-                <w:sz w:val="18"/>
+                <w:sz w:val="16"/>
               </w:rPr>
               <w:t>ordered</w:t>
             </w:r>
@@ -683,12 +1202,788 @@
             <w:pPr>
               <w:spacing w:after="40"/>
             </w:pPr>
-            <w:r/>
+            <w:r>
+              <w:rPr>
+                <w:sz w:val="16"/>
+              </w:rPr>
+            </w:r>
             <w:r>
               <w:rPr>
                 <w:b w:val="0"/>
                 <w:i w:val="0"/>
-                <w:sz w:val="18"/>
+                <w:sz w:val="16"/>
+              </w:rPr>
+              <w:t>accepted-finite-chi</w:t>
+            </w:r>
+          </w:p>
+        </w:tc>
+        <w:tc>
+          <w:tcPr>
+            <w:tcW w:type="dxa" w:w="1218"/>
+          </w:tcPr>
+          <w:p>
+            <w:pPr>
+              <w:spacing w:after="40"/>
+            </w:pPr>
+            <w:r>
+              <w:rPr>
+                <w:sz w:val="16"/>
+              </w:rPr>
+            </w:r>
+            <w:r>
+              <w:rPr>
+                <w:b w:val="0"/>
+                <w:i w:val="0"/>
+                <w:sz w:val="16"/>
+              </w:rPr>
+              <w:t>9.89e-08</w:t>
+            </w:r>
+          </w:p>
+        </w:tc>
+        <w:tc>
+          <w:tcPr>
+            <w:tcW w:type="dxa" w:w="1218"/>
+          </w:tcPr>
+          <w:p>
+            <w:pPr>
+              <w:spacing w:after="40"/>
+            </w:pPr>
+            <w:r>
+              <w:rPr>
+                <w:sz w:val="16"/>
+              </w:rPr>
+            </w:r>
+            <w:r>
+              <w:rPr>
+                <w:b w:val="0"/>
+                <w:i w:val="0"/>
+                <w:sz w:val="16"/>
+              </w:rPr>
+              <w:t>0.9925456753</w:t>
+            </w:r>
+          </w:p>
+        </w:tc>
+        <w:tc>
+          <w:tcPr>
+            <w:tcW w:type="dxa" w:w="1218"/>
+          </w:tcPr>
+          <w:p>
+            <w:pPr>
+              <w:spacing w:after="40"/>
+            </w:pPr>
+            <w:r>
+              <w:rPr>
+                <w:sz w:val="16"/>
+              </w:rPr>
+            </w:r>
+            <w:r>
+              <w:rPr>
+                <w:b w:val="0"/>
+                <w:i w:val="0"/>
+                <w:sz w:val="16"/>
+              </w:rPr>
+              <w:t>0.558892</w:t>
+            </w:r>
+          </w:p>
+        </w:tc>
+        <w:tc>
+          <w:tcPr>
+            <w:tcW w:type="dxa" w:w="1218"/>
+          </w:tcPr>
+          <w:p>
+            <w:pPr>
+              <w:spacing w:after="40"/>
+            </w:pPr>
+            <w:r>
+              <w:rPr>
+                <w:sz w:val="16"/>
+              </w:rPr>
+            </w:r>
+            <w:r>
+              <w:rPr>
+                <w:b w:val="0"/>
+                <w:i w:val="0"/>
+                <w:sz w:val="16"/>
+              </w:rPr>
+              <w:t>0.528373</w:t>
+            </w:r>
+          </w:p>
+        </w:tc>
+        <w:tc>
+          <w:tcPr>
+            <w:tcW w:type="dxa" w:w="1218"/>
+          </w:tcPr>
+          <w:p>
+            <w:pPr>
+              <w:spacing w:after="40"/>
+            </w:pPr>
+            <w:r>
+              <w:rPr>
+                <w:sz w:val="16"/>
+              </w:rPr>
+            </w:r>
+            <w:r>
+              <w:rPr>
+                <w:b w:val="0"/>
+                <w:i w:val="0"/>
+                <w:sz w:val="16"/>
+              </w:rPr>
+              <w:t>48.19</w:t>
+            </w:r>
+          </w:p>
+        </w:tc>
+      </w:tr>
+      <w:tr>
+        <w:trPr>
+          <w:cantSplit/>
+        </w:trPr>
+        <w:tc>
+          <w:tcPr>
+            <w:tcW w:type="dxa" w:w="1218"/>
+            <w:shd w:val="clear" w:color="auto" w:fill="F5F7FA"/>
+          </w:tcPr>
+          <w:p>
+            <w:pPr>
+              <w:spacing w:after="40"/>
+            </w:pPr>
+            <w:r>
+              <w:rPr>
+                <w:sz w:val="16"/>
+              </w:rPr>
+            </w:r>
+            <w:r>
+              <w:rPr>
+                <w:b w:val="0"/>
+                <w:i w:val="0"/>
+                <w:sz w:val="16"/>
+              </w:rPr>
+              <w:t>0.3047000</w:t>
+            </w:r>
+          </w:p>
+        </w:tc>
+        <w:tc>
+          <w:tcPr>
+            <w:tcW w:type="dxa" w:w="1218"/>
+            <w:shd w:val="clear" w:color="auto" w:fill="F5F7FA"/>
+          </w:tcPr>
+          <w:p>
+            <w:pPr>
+              <w:spacing w:after="40"/>
+            </w:pPr>
+            <w:r>
+              <w:rPr>
+                <w:sz w:val="16"/>
+              </w:rPr>
+            </w:r>
+            <w:r>
+              <w:rPr>
+                <w:b w:val="0"/>
+                <w:i w:val="0"/>
+                <w:sz w:val="16"/>
+              </w:rPr>
+              <w:t>disordered</w:t>
+            </w:r>
+          </w:p>
+        </w:tc>
+        <w:tc>
+          <w:tcPr>
+            <w:tcW w:type="dxa" w:w="1218"/>
+            <w:shd w:val="clear" w:color="auto" w:fill="F5F7FA"/>
+          </w:tcPr>
+          <w:p>
+            <w:pPr>
+              <w:spacing w:after="40"/>
+            </w:pPr>
+            <w:r>
+              <w:rPr>
+                <w:sz w:val="16"/>
+              </w:rPr>
+            </w:r>
+            <w:r>
+              <w:rPr>
+                <w:b w:val="0"/>
+                <w:i w:val="0"/>
+                <w:sz w:val="16"/>
+              </w:rPr>
+              <w:t>accepted-finite-chi</w:t>
+            </w:r>
+          </w:p>
+        </w:tc>
+        <w:tc>
+          <w:tcPr>
+            <w:tcW w:type="dxa" w:w="1218"/>
+            <w:shd w:val="clear" w:color="auto" w:fill="F5F7FA"/>
+          </w:tcPr>
+          <w:p>
+            <w:pPr>
+              <w:spacing w:after="40"/>
+            </w:pPr>
+            <w:r>
+              <w:rPr>
+                <w:sz w:val="16"/>
+              </w:rPr>
+            </w:r>
+            <w:r>
+              <w:rPr>
+                <w:b w:val="0"/>
+                <w:i w:val="0"/>
+                <w:sz w:val="16"/>
+              </w:rPr>
+              <w:t>9.88e-08</w:t>
+            </w:r>
+          </w:p>
+        </w:tc>
+        <w:tc>
+          <w:tcPr>
+            <w:tcW w:type="dxa" w:w="1218"/>
+            <w:shd w:val="clear" w:color="auto" w:fill="F5F7FA"/>
+          </w:tcPr>
+          <w:p>
+            <w:pPr>
+              <w:spacing w:after="40"/>
+            </w:pPr>
+            <w:r>
+              <w:rPr>
+                <w:sz w:val="16"/>
+              </w:rPr>
+            </w:r>
+            <w:r>
+              <w:rPr>
+                <w:b w:val="0"/>
+                <w:i w:val="0"/>
+                <w:sz w:val="16"/>
+              </w:rPr>
+              <w:t>0.9925456753</w:t>
+            </w:r>
+          </w:p>
+        </w:tc>
+        <w:tc>
+          <w:tcPr>
+            <w:tcW w:type="dxa" w:w="1218"/>
+            <w:shd w:val="clear" w:color="auto" w:fill="F5F7FA"/>
+          </w:tcPr>
+          <w:p>
+            <w:pPr>
+              <w:spacing w:after="40"/>
+            </w:pPr>
+            <w:r>
+              <w:rPr>
+                <w:sz w:val="16"/>
+              </w:rPr>
+            </w:r>
+            <w:r>
+              <w:rPr>
+                <w:b w:val="0"/>
+                <w:i w:val="0"/>
+                <w:sz w:val="16"/>
+              </w:rPr>
+              <w:t>0.558909</w:t>
+            </w:r>
+          </w:p>
+        </w:tc>
+        <w:tc>
+          <w:tcPr>
+            <w:tcW w:type="dxa" w:w="1218"/>
+            <w:shd w:val="clear" w:color="auto" w:fill="F5F7FA"/>
+          </w:tcPr>
+          <w:p>
+            <w:pPr>
+              <w:spacing w:after="40"/>
+            </w:pPr>
+            <w:r>
+              <w:rPr>
+                <w:sz w:val="16"/>
+              </w:rPr>
+            </w:r>
+            <w:r>
+              <w:rPr>
+                <w:b w:val="0"/>
+                <w:i w:val="0"/>
+                <w:sz w:val="16"/>
+              </w:rPr>
+              <w:t>0.528386</w:t>
+            </w:r>
+          </w:p>
+        </w:tc>
+        <w:tc>
+          <w:tcPr>
+            <w:tcW w:type="dxa" w:w="1218"/>
+            <w:shd w:val="clear" w:color="auto" w:fill="F5F7FA"/>
+          </w:tcPr>
+          <w:p>
+            <w:pPr>
+              <w:spacing w:after="40"/>
+            </w:pPr>
+            <w:r>
+              <w:rPr>
+                <w:sz w:val="16"/>
+              </w:rPr>
+            </w:r>
+            <w:r>
+              <w:rPr>
+                <w:b w:val="0"/>
+                <w:i w:val="0"/>
+                <w:sz w:val="16"/>
+              </w:rPr>
+              <w:t>48.19</w:t>
+            </w:r>
+          </w:p>
+        </w:tc>
+      </w:tr>
+      <w:tr>
+        <w:trPr>
+          <w:cantSplit/>
+        </w:trPr>
+        <w:tc>
+          <w:tcPr>
+            <w:tcW w:type="dxa" w:w="1218"/>
+          </w:tcPr>
+          <w:p>
+            <w:pPr>
+              <w:spacing w:after="40"/>
+            </w:pPr>
+            <w:r>
+              <w:rPr>
+                <w:sz w:val="16"/>
+              </w:rPr>
+            </w:r>
+            <w:r>
+              <w:rPr>
+                <w:b w:val="0"/>
+                <w:i w:val="0"/>
+                <w:sz w:val="16"/>
+              </w:rPr>
+              <w:t>0.3048600</w:t>
+            </w:r>
+          </w:p>
+        </w:tc>
+        <w:tc>
+          <w:tcPr>
+            <w:tcW w:type="dxa" w:w="1218"/>
+          </w:tcPr>
+          <w:p>
+            <w:pPr>
+              <w:spacing w:after="40"/>
+            </w:pPr>
+            <w:r>
+              <w:rPr>
+                <w:sz w:val="16"/>
+              </w:rPr>
+            </w:r>
+            <w:r>
+              <w:rPr>
+                <w:b w:val="0"/>
+                <w:i w:val="0"/>
+                <w:sz w:val="16"/>
+              </w:rPr>
+              <w:t>ordered</w:t>
+            </w:r>
+          </w:p>
+        </w:tc>
+        <w:tc>
+          <w:tcPr>
+            <w:tcW w:type="dxa" w:w="1218"/>
+          </w:tcPr>
+          <w:p>
+            <w:pPr>
+              <w:spacing w:after="40"/>
+            </w:pPr>
+            <w:r>
+              <w:rPr>
+                <w:sz w:val="16"/>
+              </w:rPr>
+            </w:r>
+            <w:r>
+              <w:rPr>
+                <w:b w:val="0"/>
+                <w:i w:val="0"/>
+                <w:sz w:val="16"/>
+              </w:rPr>
+              <w:t>accepted-stationary-at-finite-chi</w:t>
+            </w:r>
+          </w:p>
+        </w:tc>
+        <w:tc>
+          <w:tcPr>
+            <w:tcW w:type="dxa" w:w="1218"/>
+          </w:tcPr>
+          <w:p>
+            <w:pPr>
+              <w:spacing w:after="40"/>
+            </w:pPr>
+            <w:r>
+              <w:rPr>
+                <w:sz w:val="16"/>
+              </w:rPr>
+            </w:r>
+            <w:r>
+              <w:rPr>
+                <w:b w:val="0"/>
+                <w:i w:val="0"/>
+                <w:sz w:val="16"/>
+              </w:rPr>
+              <w:t>9.99e-08</w:t>
+            </w:r>
+          </w:p>
+        </w:tc>
+        <w:tc>
+          <w:tcPr>
+            <w:tcW w:type="dxa" w:w="1218"/>
+          </w:tcPr>
+          <w:p>
+            <w:pPr>
+              <w:spacing w:after="40"/>
+            </w:pPr>
+            <w:r>
+              <w:rPr>
+                <w:sz w:val="16"/>
+              </w:rPr>
+            </w:r>
+            <w:r>
+              <w:rPr>
+                <w:b w:val="0"/>
+                <w:i w:val="0"/>
+                <w:sz w:val="16"/>
+              </w:rPr>
+              <w:t>0.9930620839</w:t>
+            </w:r>
+          </w:p>
+        </w:tc>
+        <w:tc>
+          <w:tcPr>
+            <w:tcW w:type="dxa" w:w="1218"/>
+          </w:tcPr>
+          <w:p>
+            <w:pPr>
+              <w:spacing w:after="40"/>
+            </w:pPr>
+            <w:r>
+              <w:rPr>
+                <w:sz w:val="16"/>
+              </w:rPr>
+            </w:r>
+            <w:r>
+              <w:rPr>
+                <w:b w:val="0"/>
+                <w:i w:val="0"/>
+                <w:sz w:val="16"/>
+              </w:rPr>
+              <w:t>0.000284</w:t>
+            </w:r>
+          </w:p>
+        </w:tc>
+        <w:tc>
+          <w:tcPr>
+            <w:tcW w:type="dxa" w:w="1218"/>
+          </w:tcPr>
+          <w:p>
+            <w:pPr>
+              <w:spacing w:after="40"/>
+            </w:pPr>
+            <w:r>
+              <w:rPr>
+                <w:sz w:val="16"/>
+              </w:rPr>
+            </w:r>
+            <w:r>
+              <w:rPr>
+                <w:b w:val="0"/>
+                <w:i w:val="0"/>
+                <w:sz w:val="16"/>
+              </w:rPr>
+              <w:t>0.000448</w:t>
+            </w:r>
+          </w:p>
+        </w:tc>
+        <w:tc>
+          <w:tcPr>
+            <w:tcW w:type="dxa" w:w="1218"/>
+          </w:tcPr>
+          <w:p>
+            <w:pPr>
+              <w:spacing w:after="40"/>
+            </w:pPr>
+            <w:r>
+              <w:rPr>
+                <w:sz w:val="16"/>
+              </w:rPr>
+            </w:r>
+            <w:r>
+              <w:rPr>
+                <w:b w:val="0"/>
+                <w:i w:val="0"/>
+                <w:sz w:val="16"/>
+              </w:rPr>
+              <w:t>59.56</w:t>
+            </w:r>
+          </w:p>
+        </w:tc>
+      </w:tr>
+      <w:tr>
+        <w:trPr>
+          <w:cantSplit/>
+        </w:trPr>
+        <w:tc>
+          <w:tcPr>
+            <w:tcW w:type="dxa" w:w="1218"/>
+            <w:shd w:val="clear" w:color="auto" w:fill="F5F7FA"/>
+          </w:tcPr>
+          <w:p>
+            <w:pPr>
+              <w:spacing w:after="40"/>
+            </w:pPr>
+            <w:r>
+              <w:rPr>
+                <w:sz w:val="16"/>
+              </w:rPr>
+            </w:r>
+            <w:r>
+              <w:rPr>
+                <w:b w:val="0"/>
+                <w:i w:val="0"/>
+                <w:sz w:val="16"/>
+              </w:rPr>
+              <w:t>0.3048600</w:t>
+            </w:r>
+          </w:p>
+        </w:tc>
+        <w:tc>
+          <w:tcPr>
+            <w:tcW w:type="dxa" w:w="1218"/>
+            <w:shd w:val="clear" w:color="auto" w:fill="F5F7FA"/>
+          </w:tcPr>
+          <w:p>
+            <w:pPr>
+              <w:spacing w:after="40"/>
+            </w:pPr>
+            <w:r>
+              <w:rPr>
+                <w:sz w:val="16"/>
+              </w:rPr>
+            </w:r>
+            <w:r>
+              <w:rPr>
+                <w:b w:val="0"/>
+                <w:i w:val="0"/>
+                <w:sz w:val="16"/>
+              </w:rPr>
+              <w:t>disordered</w:t>
+            </w:r>
+          </w:p>
+        </w:tc>
+        <w:tc>
+          <w:tcPr>
+            <w:tcW w:type="dxa" w:w="1218"/>
+            <w:shd w:val="clear" w:color="auto" w:fill="F5F7FA"/>
+          </w:tcPr>
+          <w:p>
+            <w:pPr>
+              <w:spacing w:after="40"/>
+            </w:pPr>
+            <w:r>
+              <w:rPr>
+                <w:sz w:val="16"/>
+              </w:rPr>
+            </w:r>
+            <w:r>
+              <w:rPr>
+                <w:b w:val="0"/>
+                <w:i w:val="0"/>
+                <w:sz w:val="16"/>
+              </w:rPr>
+              <w:t>accepted-stationary-at-finite-chi</w:t>
+            </w:r>
+          </w:p>
+        </w:tc>
+        <w:tc>
+          <w:tcPr>
+            <w:tcW w:type="dxa" w:w="1218"/>
+            <w:shd w:val="clear" w:color="auto" w:fill="F5F7FA"/>
+          </w:tcPr>
+          <w:p>
+            <w:pPr>
+              <w:spacing w:after="40"/>
+            </w:pPr>
+            <w:r>
+              <w:rPr>
+                <w:sz w:val="16"/>
+              </w:rPr>
+            </w:r>
+            <w:r>
+              <w:rPr>
+                <w:b w:val="0"/>
+                <w:i w:val="0"/>
+                <w:sz w:val="16"/>
+              </w:rPr>
+              <w:t>9.57e-08</w:t>
+            </w:r>
+          </w:p>
+        </w:tc>
+        <w:tc>
+          <w:tcPr>
+            <w:tcW w:type="dxa" w:w="1218"/>
+            <w:shd w:val="clear" w:color="auto" w:fill="F5F7FA"/>
+          </w:tcPr>
+          <w:p>
+            <w:pPr>
+              <w:spacing w:after="40"/>
+            </w:pPr>
+            <w:r>
+              <w:rPr>
+                <w:sz w:val="16"/>
+              </w:rPr>
+            </w:r>
+            <w:r>
+              <w:rPr>
+                <w:b w:val="0"/>
+                <w:i w:val="0"/>
+                <w:sz w:val="16"/>
+              </w:rPr>
+              <w:t>0.9930620802</w:t>
+            </w:r>
+          </w:p>
+        </w:tc>
+        <w:tc>
+          <w:tcPr>
+            <w:tcW w:type="dxa" w:w="1218"/>
+            <w:shd w:val="clear" w:color="auto" w:fill="F5F7FA"/>
+          </w:tcPr>
+          <w:p>
+            <w:pPr>
+              <w:spacing w:after="40"/>
+            </w:pPr>
+            <w:r>
+              <w:rPr>
+                <w:sz w:val="16"/>
+              </w:rPr>
+            </w:r>
+            <w:r>
+              <w:rPr>
+                <w:b w:val="0"/>
+                <w:i w:val="0"/>
+                <w:sz w:val="16"/>
+              </w:rPr>
+              <w:t>0.003909</w:t>
+            </w:r>
+          </w:p>
+        </w:tc>
+        <w:tc>
+          <w:tcPr>
+            <w:tcW w:type="dxa" w:w="1218"/>
+            <w:shd w:val="clear" w:color="auto" w:fill="F5F7FA"/>
+          </w:tcPr>
+          <w:p>
+            <w:pPr>
+              <w:spacing w:after="40"/>
+            </w:pPr>
+            <w:r>
+              <w:rPr>
+                <w:sz w:val="16"/>
+              </w:rPr>
+            </w:r>
+            <w:r>
+              <w:rPr>
+                <w:b w:val="0"/>
+                <w:i w:val="0"/>
+                <w:sz w:val="16"/>
+              </w:rPr>
+              <w:t>0.003719</w:t>
+            </w:r>
+          </w:p>
+        </w:tc>
+        <w:tc>
+          <w:tcPr>
+            <w:tcW w:type="dxa" w:w="1218"/>
+            <w:shd w:val="clear" w:color="auto" w:fill="F5F7FA"/>
+          </w:tcPr>
+          <w:p>
+            <w:pPr>
+              <w:spacing w:after="40"/>
+            </w:pPr>
+            <w:r>
+              <w:rPr>
+                <w:sz w:val="16"/>
+              </w:rPr>
+            </w:r>
+            <w:r>
+              <w:rPr>
+                <w:b w:val="0"/>
+                <w:i w:val="0"/>
+                <w:sz w:val="16"/>
+              </w:rPr>
+              <w:t>62.49</w:t>
+            </w:r>
+          </w:p>
+        </w:tc>
+      </w:tr>
+      <w:tr>
+        <w:trPr>
+          <w:cantSplit/>
+        </w:trPr>
+        <w:tc>
+          <w:tcPr>
+            <w:tcW w:type="dxa" w:w="1218"/>
+          </w:tcPr>
+          <w:p>
+            <w:pPr>
+              <w:spacing w:after="40"/>
+            </w:pPr>
+            <w:r>
+              <w:rPr>
+                <w:sz w:val="16"/>
+              </w:rPr>
+            </w:r>
+            <w:r>
+              <w:rPr>
+                <w:b w:val="0"/>
+                <w:i w:val="0"/>
+                <w:sz w:val="16"/>
+              </w:rPr>
+              <w:t>0.3050000</w:t>
+            </w:r>
+          </w:p>
+        </w:tc>
+        <w:tc>
+          <w:tcPr>
+            <w:tcW w:type="dxa" w:w="1218"/>
+          </w:tcPr>
+          <w:p>
+            <w:pPr>
+              <w:spacing w:after="40"/>
+            </w:pPr>
+            <w:r>
+              <w:rPr>
+                <w:sz w:val="16"/>
+              </w:rPr>
+            </w:r>
+            <w:r>
+              <w:rPr>
+                <w:b w:val="0"/>
+                <w:i w:val="0"/>
+                <w:sz w:val="16"/>
+              </w:rPr>
+              <w:t>ordered</w:t>
+            </w:r>
+          </w:p>
+        </w:tc>
+        <w:tc>
+          <w:tcPr>
+            <w:tcW w:type="dxa" w:w="1218"/>
+          </w:tcPr>
+          <w:p>
+            <w:pPr>
+              <w:spacing w:after="40"/>
+            </w:pPr>
+            <w:r>
+              <w:rPr>
+                <w:sz w:val="16"/>
+              </w:rPr>
+            </w:r>
+            <w:r>
+              <w:rPr>
+                <w:b w:val="0"/>
+                <w:i w:val="0"/>
+                <w:sz w:val="16"/>
               </w:rPr>
               <w:t>pending</w:t>
             </w:r>
@@ -702,12 +1997,16 @@
             <w:pPr>
               <w:spacing w:after="40"/>
             </w:pPr>
-            <w:r/>
+            <w:r>
+              <w:rPr>
+                <w:sz w:val="16"/>
+              </w:rPr>
+            </w:r>
             <w:r>
               <w:rPr>
                 <w:b w:val="0"/>
                 <w:i w:val="0"/>
-                <w:sz w:val="18"/>
+                <w:sz w:val="16"/>
               </w:rPr>
               <w:t>—</w:t>
             </w:r>
@@ -721,12 +2020,16 @@
             <w:pPr>
               <w:spacing w:after="40"/>
             </w:pPr>
-            <w:r/>
+            <w:r>
+              <w:rPr>
+                <w:sz w:val="16"/>
+              </w:rPr>
+            </w:r>
             <w:r>
               <w:rPr>
                 <w:b w:val="0"/>
                 <w:i w:val="0"/>
-                <w:sz w:val="18"/>
+                <w:sz w:val="16"/>
               </w:rPr>
               <w:t>—</w:t>
             </w:r>
@@ -740,12 +2043,16 @@
             <w:pPr>
               <w:spacing w:after="40"/>
             </w:pPr>
-            <w:r/>
+            <w:r>
+              <w:rPr>
+                <w:sz w:val="16"/>
+              </w:rPr>
+            </w:r>
             <w:r>
               <w:rPr>
                 <w:b w:val="0"/>
                 <w:i w:val="0"/>
-                <w:sz w:val="18"/>
+                <w:sz w:val="16"/>
               </w:rPr>
               <w:t>—</w:t>
             </w:r>
@@ -759,12 +2066,16 @@
             <w:pPr>
               <w:spacing w:after="40"/>
             </w:pPr>
-            <w:r/>
+            <w:r>
+              <w:rPr>
+                <w:sz w:val="16"/>
+              </w:rPr>
+            </w:r>
             <w:r>
               <w:rPr>
                 <w:b w:val="0"/>
                 <w:i w:val="0"/>
-                <w:sz w:val="18"/>
+                <w:sz w:val="16"/>
               </w:rPr>
               <w:t>—</w:t>
             </w:r>
@@ -778,12 +2089,16 @@
             <w:pPr>
               <w:spacing w:after="40"/>
             </w:pPr>
-            <w:r/>
+            <w:r>
+              <w:rPr>
+                <w:sz w:val="16"/>
+              </w:rPr>
+            </w:r>
             <w:r>
               <w:rPr>
                 <w:b w:val="0"/>
                 <w:i w:val="0"/>
-                <w:sz w:val="18"/>
+                <w:sz w:val="16"/>
               </w:rPr>
               <w:t>—</w:t>
             </w:r>
@@ -791,6 +2106,206 @@
         </w:tc>
       </w:tr>
       <w:tr>
+        <w:trPr>
+          <w:cantSplit/>
+        </w:trPr>
+        <w:tc>
+          <w:tcPr>
+            <w:tcW w:type="dxa" w:w="1218"/>
+            <w:shd w:val="clear" w:color="auto" w:fill="F5F7FA"/>
+          </w:tcPr>
+          <w:p>
+            <w:pPr>
+              <w:spacing w:after="40"/>
+            </w:pPr>
+            <w:r>
+              <w:rPr>
+                <w:sz w:val="16"/>
+              </w:rPr>
+            </w:r>
+            <w:r>
+              <w:rPr>
+                <w:b w:val="0"/>
+                <w:i w:val="0"/>
+                <w:sz w:val="16"/>
+              </w:rPr>
+              <w:t>0.3050000</w:t>
+            </w:r>
+          </w:p>
+        </w:tc>
+        <w:tc>
+          <w:tcPr>
+            <w:tcW w:type="dxa" w:w="1218"/>
+            <w:shd w:val="clear" w:color="auto" w:fill="F5F7FA"/>
+          </w:tcPr>
+          <w:p>
+            <w:pPr>
+              <w:spacing w:after="40"/>
+            </w:pPr>
+            <w:r>
+              <w:rPr>
+                <w:sz w:val="16"/>
+              </w:rPr>
+            </w:r>
+            <w:r>
+              <w:rPr>
+                <w:b w:val="0"/>
+                <w:i w:val="0"/>
+                <w:sz w:val="16"/>
+              </w:rPr>
+              <w:t>disordered</w:t>
+            </w:r>
+          </w:p>
+        </w:tc>
+        <w:tc>
+          <w:tcPr>
+            <w:tcW w:type="dxa" w:w="1218"/>
+            <w:shd w:val="clear" w:color="auto" w:fill="F5F7FA"/>
+          </w:tcPr>
+          <w:p>
+            <w:pPr>
+              <w:spacing w:after="40"/>
+            </w:pPr>
+            <w:r>
+              <w:rPr>
+                <w:sz w:val="16"/>
+              </w:rPr>
+            </w:r>
+            <w:r>
+              <w:rPr>
+                <w:b w:val="0"/>
+                <w:i w:val="0"/>
+                <w:sz w:val="16"/>
+              </w:rPr>
+              <w:t>pending</w:t>
+            </w:r>
+          </w:p>
+        </w:tc>
+        <w:tc>
+          <w:tcPr>
+            <w:tcW w:type="dxa" w:w="1218"/>
+            <w:shd w:val="clear" w:color="auto" w:fill="F5F7FA"/>
+          </w:tcPr>
+          <w:p>
+            <w:pPr>
+              <w:spacing w:after="40"/>
+            </w:pPr>
+            <w:r>
+              <w:rPr>
+                <w:sz w:val="16"/>
+              </w:rPr>
+            </w:r>
+            <w:r>
+              <w:rPr>
+                <w:b w:val="0"/>
+                <w:i w:val="0"/>
+                <w:sz w:val="16"/>
+              </w:rPr>
+              <w:t>—</w:t>
+            </w:r>
+          </w:p>
+        </w:tc>
+        <w:tc>
+          <w:tcPr>
+            <w:tcW w:type="dxa" w:w="1218"/>
+            <w:shd w:val="clear" w:color="auto" w:fill="F5F7FA"/>
+          </w:tcPr>
+          <w:p>
+            <w:pPr>
+              <w:spacing w:after="40"/>
+            </w:pPr>
+            <w:r>
+              <w:rPr>
+                <w:sz w:val="16"/>
+              </w:rPr>
+            </w:r>
+            <w:r>
+              <w:rPr>
+                <w:b w:val="0"/>
+                <w:i w:val="0"/>
+                <w:sz w:val="16"/>
+              </w:rPr>
+              <w:t>—</w:t>
+            </w:r>
+          </w:p>
+        </w:tc>
+        <w:tc>
+          <w:tcPr>
+            <w:tcW w:type="dxa" w:w="1218"/>
+            <w:shd w:val="clear" w:color="auto" w:fill="F5F7FA"/>
+          </w:tcPr>
+          <w:p>
+            <w:pPr>
+              <w:spacing w:after="40"/>
+            </w:pPr>
+            <w:r>
+              <w:rPr>
+                <w:sz w:val="16"/>
+              </w:rPr>
+            </w:r>
+            <w:r>
+              <w:rPr>
+                <w:b w:val="0"/>
+                <w:i w:val="0"/>
+                <w:sz w:val="16"/>
+              </w:rPr>
+              <w:t>—</w:t>
+            </w:r>
+          </w:p>
+        </w:tc>
+        <w:tc>
+          <w:tcPr>
+            <w:tcW w:type="dxa" w:w="1218"/>
+            <w:shd w:val="clear" w:color="auto" w:fill="F5F7FA"/>
+          </w:tcPr>
+          <w:p>
+            <w:pPr>
+              <w:spacing w:after="40"/>
+            </w:pPr>
+            <w:r>
+              <w:rPr>
+                <w:sz w:val="16"/>
+              </w:rPr>
+            </w:r>
+            <w:r>
+              <w:rPr>
+                <w:b w:val="0"/>
+                <w:i w:val="0"/>
+                <w:sz w:val="16"/>
+              </w:rPr>
+              <w:t>—</w:t>
+            </w:r>
+          </w:p>
+        </w:tc>
+        <w:tc>
+          <w:tcPr>
+            <w:tcW w:type="dxa" w:w="1218"/>
+            <w:shd w:val="clear" w:color="auto" w:fill="F5F7FA"/>
+          </w:tcPr>
+          <w:p>
+            <w:pPr>
+              <w:spacing w:after="40"/>
+            </w:pPr>
+            <w:r>
+              <w:rPr>
+                <w:sz w:val="16"/>
+              </w:rPr>
+            </w:r>
+            <w:r>
+              <w:rPr>
+                <w:b w:val="0"/>
+                <w:i w:val="0"/>
+                <w:sz w:val="16"/>
+              </w:rPr>
+              <w:t>—</w:t>
+            </w:r>
+          </w:p>
+        </w:tc>
+      </w:tr>
+      <w:tr>
+        <w:trPr>
+          <w:cantSplit/>
+        </w:trPr>
         <w:tc>
           <w:tcPr>
             <w:tcW w:type="dxa" w:w="1218"/>
@@ -799,14 +2314,18 @@
             <w:pPr>
               <w:spacing w:after="40"/>
             </w:pPr>
-            <w:r/>
+            <w:r>
+              <w:rPr>
+                <w:sz w:val="16"/>
+              </w:rPr>
+            </w:r>
             <w:r>
               <w:rPr>
                 <w:b w:val="0"/>
                 <w:i w:val="0"/>
-                <w:sz w:val="18"/>
+                <w:sz w:val="16"/>
               </w:rPr>
-              <w:t>0.3045000</w:t>
+              <w:t>0.3055000</w:t>
             </w:r>
           </w:p>
         </w:tc>
@@ -818,14 +2337,18 @@
             <w:pPr>
               <w:spacing w:after="40"/>
             </w:pPr>
-            <w:r/>
+            <w:r>
+              <w:rPr>
+                <w:sz w:val="16"/>
+              </w:rPr>
+            </w:r>
             <w:r>
               <w:rPr>
                 <w:b w:val="0"/>
                 <w:i w:val="0"/>
-                <w:sz w:val="18"/>
+                <w:sz w:val="16"/>
               </w:rPr>
-              <w:t>disordered</w:t>
+              <w:t>ordered</w:t>
             </w:r>
           </w:p>
         </w:tc>
@@ -837,12 +2360,16 @@
             <w:pPr>
               <w:spacing w:after="40"/>
             </w:pPr>
-            <w:r/>
+            <w:r>
+              <w:rPr>
+                <w:sz w:val="16"/>
+              </w:rPr>
+            </w:r>
             <w:r>
               <w:rPr>
                 <w:b w:val="0"/>
                 <w:i w:val="0"/>
-                <w:sz w:val="18"/>
+                <w:sz w:val="16"/>
               </w:rPr>
               <w:t>pending</w:t>
             </w:r>
@@ -856,12 +2383,16 @@
             <w:pPr>
               <w:spacing w:after="40"/>
             </w:pPr>
-            <w:r/>
+            <w:r>
+              <w:rPr>
+                <w:sz w:val="16"/>
+              </w:rPr>
+            </w:r>
             <w:r>
               <w:rPr>
                 <w:b w:val="0"/>
                 <w:i w:val="0"/>
-                <w:sz w:val="18"/>
+                <w:sz w:val="16"/>
               </w:rPr>
               <w:t>—</w:t>
             </w:r>
@@ -875,12 +2406,16 @@
             <w:pPr>
               <w:spacing w:after="40"/>
             </w:pPr>
-            <w:r/>
+            <w:r>
+              <w:rPr>
+                <w:sz w:val="16"/>
+              </w:rPr>
+            </w:r>
             <w:r>
               <w:rPr>
                 <w:b w:val="0"/>
                 <w:i w:val="0"/>
-                <w:sz w:val="18"/>
+                <w:sz w:val="16"/>
               </w:rPr>
               <w:t>—</w:t>
             </w:r>
@@ -894,12 +2429,16 @@
             <w:pPr>
               <w:spacing w:after="40"/>
             </w:pPr>
-            <w:r/>
+            <w:r>
+              <w:rPr>
+                <w:sz w:val="16"/>
+              </w:rPr>
+            </w:r>
             <w:r>
               <w:rPr>
                 <w:b w:val="0"/>
                 <w:i w:val="0"/>
-                <w:sz w:val="18"/>
+                <w:sz w:val="16"/>
               </w:rPr>
               <w:t>—</w:t>
             </w:r>
@@ -913,12 +2452,16 @@
             <w:pPr>
               <w:spacing w:after="40"/>
             </w:pPr>
-            <w:r/>
+            <w:r>
+              <w:rPr>
+                <w:sz w:val="16"/>
+              </w:rPr>
+            </w:r>
             <w:r>
               <w:rPr>
                 <w:b w:val="0"/>
                 <w:i w:val="0"/>
-                <w:sz w:val="18"/>
+                <w:sz w:val="16"/>
               </w:rPr>
               <w:t>—</w:t>
             </w:r>
@@ -932,12 +2475,16 @@
             <w:pPr>
               <w:spacing w:after="40"/>
             </w:pPr>
-            <w:r/>
+            <w:r>
+              <w:rPr>
+                <w:sz w:val="16"/>
+              </w:rPr>
+            </w:r>
             <w:r>
               <w:rPr>
                 <w:b w:val="0"/>
                 <w:i w:val="0"/>
-                <w:sz w:val="18"/>
+                <w:sz w:val="16"/>
               </w:rPr>
               <w:t>—</w:t>
             </w:r>
@@ -945,58 +2492,76 @@
         </w:tc>
       </w:tr>
       <w:tr>
+        <w:trPr>
+          <w:cantSplit/>
+        </w:trPr>
         <w:tc>
           <w:tcPr>
             <w:tcW w:type="dxa" w:w="1218"/>
+            <w:shd w:val="clear" w:color="auto" w:fill="F5F7FA"/>
           </w:tcPr>
           <w:p>
             <w:pPr>
               <w:spacing w:after="40"/>
             </w:pPr>
-            <w:r/>
+            <w:r>
+              <w:rPr>
+                <w:sz w:val="16"/>
+              </w:rPr>
+            </w:r>
             <w:r>
               <w:rPr>
                 <w:b w:val="0"/>
                 <w:i w:val="0"/>
-                <w:sz w:val="18"/>
+                <w:sz w:val="16"/>
               </w:rPr>
-              <w:t>0.3047000</w:t>
+              <w:t>0.3055000</w:t>
             </w:r>
           </w:p>
         </w:tc>
         <w:tc>
           <w:tcPr>
             <w:tcW w:type="dxa" w:w="1218"/>
+            <w:shd w:val="clear" w:color="auto" w:fill="F5F7FA"/>
           </w:tcPr>
           <w:p>
             <w:pPr>
               <w:spacing w:after="40"/>
             </w:pPr>
-            <w:r/>
+            <w:r>
+              <w:rPr>
+                <w:sz w:val="16"/>
+              </w:rPr>
+            </w:r>
             <w:r>
               <w:rPr>
                 <w:b w:val="0"/>
                 <w:i w:val="0"/>
-                <w:sz w:val="18"/>
+                <w:sz w:val="16"/>
               </w:rPr>
-              <w:t>ordered</w:t>
+              <w:t>disordered</w:t>
             </w:r>
           </w:p>
         </w:tc>
         <w:tc>
           <w:tcPr>
             <w:tcW w:type="dxa" w:w="1218"/>
+            <w:shd w:val="clear" w:color="auto" w:fill="F5F7FA"/>
           </w:tcPr>
           <w:p>
             <w:pPr>
               <w:spacing w:after="40"/>
             </w:pPr>
-            <w:r/>
+            <w:r>
+              <w:rPr>
+                <w:sz w:val="16"/>
+              </w:rPr>
+            </w:r>
             <w:r>
               <w:rPr>
                 <w:b w:val="0"/>
                 <w:i w:val="0"/>
-                <w:sz w:val="18"/>
+                <w:sz w:val="16"/>
               </w:rPr>
               <w:t>pending</w:t>
             </w:r>
@@ -1005,17 +2570,22 @@
         <w:tc>
           <w:tcPr>
             <w:tcW w:type="dxa" w:w="1218"/>
+            <w:shd w:val="clear" w:color="auto" w:fill="F5F7FA"/>
           </w:tcPr>
           <w:p>
             <w:pPr>
               <w:spacing w:after="40"/>
             </w:pPr>
-            <w:r/>
+            <w:r>
+              <w:rPr>
+                <w:sz w:val="16"/>
+              </w:rPr>
+            </w:r>
             <w:r>
               <w:rPr>
                 <w:b w:val="0"/>
                 <w:i w:val="0"/>
-                <w:sz w:val="18"/>
+                <w:sz w:val="16"/>
               </w:rPr>
               <w:t>—</w:t>
             </w:r>
@@ -1024,17 +2594,22 @@
         <w:tc>
           <w:tcPr>
             <w:tcW w:type="dxa" w:w="1218"/>
+            <w:shd w:val="clear" w:color="auto" w:fill="F5F7FA"/>
           </w:tcPr>
           <w:p>
             <w:pPr>
               <w:spacing w:after="40"/>
             </w:pPr>
-            <w:r/>
+            <w:r>
+              <w:rPr>
+                <w:sz w:val="16"/>
+              </w:rPr>
+            </w:r>
             <w:r>
               <w:rPr>
                 <w:b w:val="0"/>
                 <w:i w:val="0"/>
-                <w:sz w:val="18"/>
+                <w:sz w:val="16"/>
               </w:rPr>
               <w:t>—</w:t>
             </w:r>
@@ -1043,17 +2618,22 @@
         <w:tc>
           <w:tcPr>
             <w:tcW w:type="dxa" w:w="1218"/>
+            <w:shd w:val="clear" w:color="auto" w:fill="F5F7FA"/>
           </w:tcPr>
           <w:p>
             <w:pPr>
               <w:spacing w:after="40"/>
             </w:pPr>
-            <w:r/>
+            <w:r>
+              <w:rPr>
+                <w:sz w:val="16"/>
+              </w:rPr>
+            </w:r>
             <w:r>
               <w:rPr>
                 <w:b w:val="0"/>
                 <w:i w:val="0"/>
-                <w:sz w:val="18"/>
+                <w:sz w:val="16"/>
               </w:rPr>
               <w:t>—</w:t>
             </w:r>
@@ -1062,17 +2642,22 @@
         <w:tc>
           <w:tcPr>
             <w:tcW w:type="dxa" w:w="1218"/>
+            <w:shd w:val="clear" w:color="auto" w:fill="F5F7FA"/>
           </w:tcPr>
           <w:p>
             <w:pPr>
               <w:spacing w:after="40"/>
             </w:pPr>
-            <w:r/>
+            <w:r>
+              <w:rPr>
+                <w:sz w:val="16"/>
+              </w:rPr>
+            </w:r>
             <w:r>
               <w:rPr>
                 <w:b w:val="0"/>
                 <w:i w:val="0"/>
-                <w:sz w:val="18"/>
+                <w:sz w:val="16"/>
               </w:rPr>
               <w:t>—</w:t>
             </w:r>
@@ -1081,1095 +2666,22 @@
         <w:tc>
           <w:tcPr>
             <w:tcW w:type="dxa" w:w="1218"/>
+            <w:shd w:val="clear" w:color="auto" w:fill="F5F7FA"/>
           </w:tcPr>
           <w:p>
             <w:pPr>
               <w:spacing w:after="40"/>
             </w:pPr>
-            <w:r/>
+            <w:r>
+              <w:rPr>
+                <w:sz w:val="16"/>
+              </w:rPr>
+            </w:r>
             <w:r>
               <w:rPr>
                 <w:b w:val="0"/>
                 <w:i w:val="0"/>
-                <w:sz w:val="18"/>
-              </w:rPr>
-              <w:t>—</w:t>
-            </w:r>
-          </w:p>
-        </w:tc>
-      </w:tr>
-      <w:tr>
-        <w:tc>
-          <w:tcPr>
-            <w:tcW w:type="dxa" w:w="1218"/>
-          </w:tcPr>
-          <w:p>
-            <w:pPr>
-              <w:spacing w:after="40"/>
-            </w:pPr>
-            <w:r/>
-            <w:r>
-              <w:rPr>
-                <w:b w:val="0"/>
-                <w:i w:val="0"/>
-                <w:sz w:val="18"/>
-              </w:rPr>
-              <w:t>0.3047000</w:t>
-            </w:r>
-          </w:p>
-        </w:tc>
-        <w:tc>
-          <w:tcPr>
-            <w:tcW w:type="dxa" w:w="1218"/>
-          </w:tcPr>
-          <w:p>
-            <w:pPr>
-              <w:spacing w:after="40"/>
-            </w:pPr>
-            <w:r/>
-            <w:r>
-              <w:rPr>
-                <w:b w:val="0"/>
-                <w:i w:val="0"/>
-                <w:sz w:val="18"/>
-              </w:rPr>
-              <w:t>disordered</w:t>
-            </w:r>
-          </w:p>
-        </w:tc>
-        <w:tc>
-          <w:tcPr>
-            <w:tcW w:type="dxa" w:w="1218"/>
-          </w:tcPr>
-          <w:p>
-            <w:pPr>
-              <w:spacing w:after="40"/>
-            </w:pPr>
-            <w:r/>
-            <w:r>
-              <w:rPr>
-                <w:b w:val="0"/>
-                <w:i w:val="0"/>
-                <w:sz w:val="18"/>
-              </w:rPr>
-              <w:t>pending</w:t>
-            </w:r>
-          </w:p>
-        </w:tc>
-        <w:tc>
-          <w:tcPr>
-            <w:tcW w:type="dxa" w:w="1218"/>
-          </w:tcPr>
-          <w:p>
-            <w:pPr>
-              <w:spacing w:after="40"/>
-            </w:pPr>
-            <w:r/>
-            <w:r>
-              <w:rPr>
-                <w:b w:val="0"/>
-                <w:i w:val="0"/>
-                <w:sz w:val="18"/>
-              </w:rPr>
-              <w:t>—</w:t>
-            </w:r>
-          </w:p>
-        </w:tc>
-        <w:tc>
-          <w:tcPr>
-            <w:tcW w:type="dxa" w:w="1218"/>
-          </w:tcPr>
-          <w:p>
-            <w:pPr>
-              <w:spacing w:after="40"/>
-            </w:pPr>
-            <w:r/>
-            <w:r>
-              <w:rPr>
-                <w:b w:val="0"/>
-                <w:i w:val="0"/>
-                <w:sz w:val="18"/>
-              </w:rPr>
-              <w:t>—</w:t>
-            </w:r>
-          </w:p>
-        </w:tc>
-        <w:tc>
-          <w:tcPr>
-            <w:tcW w:type="dxa" w:w="1218"/>
-          </w:tcPr>
-          <w:p>
-            <w:pPr>
-              <w:spacing w:after="40"/>
-            </w:pPr>
-            <w:r/>
-            <w:r>
-              <w:rPr>
-                <w:b w:val="0"/>
-                <w:i w:val="0"/>
-                <w:sz w:val="18"/>
-              </w:rPr>
-              <w:t>—</w:t>
-            </w:r>
-          </w:p>
-        </w:tc>
-        <w:tc>
-          <w:tcPr>
-            <w:tcW w:type="dxa" w:w="1218"/>
-          </w:tcPr>
-          <w:p>
-            <w:pPr>
-              <w:spacing w:after="40"/>
-            </w:pPr>
-            <w:r/>
-            <w:r>
-              <w:rPr>
-                <w:b w:val="0"/>
-                <w:i w:val="0"/>
-                <w:sz w:val="18"/>
-              </w:rPr>
-              <w:t>—</w:t>
-            </w:r>
-          </w:p>
-        </w:tc>
-        <w:tc>
-          <w:tcPr>
-            <w:tcW w:type="dxa" w:w="1218"/>
-          </w:tcPr>
-          <w:p>
-            <w:pPr>
-              <w:spacing w:after="40"/>
-            </w:pPr>
-            <w:r/>
-            <w:r>
-              <w:rPr>
-                <w:b w:val="0"/>
-                <w:i w:val="0"/>
-                <w:sz w:val="18"/>
-              </w:rPr>
-              <w:t>—</w:t>
-            </w:r>
-          </w:p>
-        </w:tc>
-      </w:tr>
-      <w:tr>
-        <w:tc>
-          <w:tcPr>
-            <w:tcW w:type="dxa" w:w="1218"/>
-          </w:tcPr>
-          <w:p>
-            <w:pPr>
-              <w:spacing w:after="40"/>
-            </w:pPr>
-            <w:r/>
-            <w:r>
-              <w:rPr>
-                <w:b w:val="0"/>
-                <w:i w:val="0"/>
-                <w:sz w:val="18"/>
-              </w:rPr>
-              <w:t>0.3048600</w:t>
-            </w:r>
-          </w:p>
-        </w:tc>
-        <w:tc>
-          <w:tcPr>
-            <w:tcW w:type="dxa" w:w="1218"/>
-          </w:tcPr>
-          <w:p>
-            <w:pPr>
-              <w:spacing w:after="40"/>
-            </w:pPr>
-            <w:r/>
-            <w:r>
-              <w:rPr>
-                <w:b w:val="0"/>
-                <w:i w:val="0"/>
-                <w:sz w:val="18"/>
-              </w:rPr>
-              <w:t>ordered</w:t>
-            </w:r>
-          </w:p>
-        </w:tc>
-        <w:tc>
-          <w:tcPr>
-            <w:tcW w:type="dxa" w:w="1218"/>
-          </w:tcPr>
-          <w:p>
-            <w:pPr>
-              <w:spacing w:after="40"/>
-            </w:pPr>
-            <w:r/>
-            <w:r>
-              <w:rPr>
-                <w:b w:val="0"/>
-                <w:i w:val="0"/>
-                <w:sz w:val="18"/>
-              </w:rPr>
-              <w:t>accepted-stationary-at-finite-chi</w:t>
-            </w:r>
-          </w:p>
-        </w:tc>
-        <w:tc>
-          <w:tcPr>
-            <w:tcW w:type="dxa" w:w="1218"/>
-          </w:tcPr>
-          <w:p>
-            <w:pPr>
-              <w:spacing w:after="40"/>
-            </w:pPr>
-            <w:r/>
-            <w:r>
-              <w:rPr>
-                <w:b w:val="0"/>
-                <w:i w:val="0"/>
-                <w:sz w:val="18"/>
-              </w:rPr>
-              <w:t>9.99e-08</w:t>
-            </w:r>
-          </w:p>
-        </w:tc>
-        <w:tc>
-          <w:tcPr>
-            <w:tcW w:type="dxa" w:w="1218"/>
-          </w:tcPr>
-          <w:p>
-            <w:pPr>
-              <w:spacing w:after="40"/>
-            </w:pPr>
-            <w:r/>
-            <w:r>
-              <w:rPr>
-                <w:b w:val="0"/>
-                <w:i w:val="0"/>
-                <w:sz w:val="18"/>
-              </w:rPr>
-              <w:t>0.9930620839</w:t>
-            </w:r>
-          </w:p>
-        </w:tc>
-        <w:tc>
-          <w:tcPr>
-            <w:tcW w:type="dxa" w:w="1218"/>
-          </w:tcPr>
-          <w:p>
-            <w:pPr>
-              <w:spacing w:after="40"/>
-            </w:pPr>
-            <w:r/>
-            <w:r>
-              <w:rPr>
-                <w:b w:val="0"/>
-                <w:i w:val="0"/>
-                <w:sz w:val="18"/>
-              </w:rPr>
-              <w:t>0.000284</w:t>
-            </w:r>
-          </w:p>
-        </w:tc>
-        <w:tc>
-          <w:tcPr>
-            <w:tcW w:type="dxa" w:w="1218"/>
-          </w:tcPr>
-          <w:p>
-            <w:pPr>
-              <w:spacing w:after="40"/>
-            </w:pPr>
-            <w:r/>
-            <w:r>
-              <w:rPr>
-                <w:b w:val="0"/>
-                <w:i w:val="0"/>
-                <w:sz w:val="18"/>
-              </w:rPr>
-              <w:t>0.000448</w:t>
-            </w:r>
-          </w:p>
-        </w:tc>
-        <w:tc>
-          <w:tcPr>
-            <w:tcW w:type="dxa" w:w="1218"/>
-          </w:tcPr>
-          <w:p>
-            <w:pPr>
-              <w:spacing w:after="40"/>
-            </w:pPr>
-            <w:r/>
-            <w:r>
-              <w:rPr>
-                <w:b w:val="0"/>
-                <w:i w:val="0"/>
-                <w:sz w:val="18"/>
-              </w:rPr>
-              <w:t>59.56</w:t>
-            </w:r>
-          </w:p>
-        </w:tc>
-      </w:tr>
-      <w:tr>
-        <w:tc>
-          <w:tcPr>
-            <w:tcW w:type="dxa" w:w="1218"/>
-          </w:tcPr>
-          <w:p>
-            <w:pPr>
-              <w:spacing w:after="40"/>
-            </w:pPr>
-            <w:r/>
-            <w:r>
-              <w:rPr>
-                <w:b w:val="0"/>
-                <w:i w:val="0"/>
-                <w:sz w:val="18"/>
-              </w:rPr>
-              <w:t>0.3048600</w:t>
-            </w:r>
-          </w:p>
-        </w:tc>
-        <w:tc>
-          <w:tcPr>
-            <w:tcW w:type="dxa" w:w="1218"/>
-          </w:tcPr>
-          <w:p>
-            <w:pPr>
-              <w:spacing w:after="40"/>
-            </w:pPr>
-            <w:r/>
-            <w:r>
-              <w:rPr>
-                <w:b w:val="0"/>
-                <w:i w:val="0"/>
-                <w:sz w:val="18"/>
-              </w:rPr>
-              <w:t>disordered</w:t>
-            </w:r>
-          </w:p>
-        </w:tc>
-        <w:tc>
-          <w:tcPr>
-            <w:tcW w:type="dxa" w:w="1218"/>
-          </w:tcPr>
-          <w:p>
-            <w:pPr>
-              <w:spacing w:after="40"/>
-            </w:pPr>
-            <w:r/>
-            <w:r>
-              <w:rPr>
-                <w:b w:val="0"/>
-                <w:i w:val="0"/>
-                <w:sz w:val="18"/>
-              </w:rPr>
-              <w:t>accepted-stationary-at-finite-chi</w:t>
-            </w:r>
-          </w:p>
-        </w:tc>
-        <w:tc>
-          <w:tcPr>
-            <w:tcW w:type="dxa" w:w="1218"/>
-          </w:tcPr>
-          <w:p>
-            <w:pPr>
-              <w:spacing w:after="40"/>
-            </w:pPr>
-            <w:r/>
-            <w:r>
-              <w:rPr>
-                <w:b w:val="0"/>
-                <w:i w:val="0"/>
-                <w:sz w:val="18"/>
-              </w:rPr>
-              <w:t>9.57e-08</w:t>
-            </w:r>
-          </w:p>
-        </w:tc>
-        <w:tc>
-          <w:tcPr>
-            <w:tcW w:type="dxa" w:w="1218"/>
-          </w:tcPr>
-          <w:p>
-            <w:pPr>
-              <w:spacing w:after="40"/>
-            </w:pPr>
-            <w:r/>
-            <w:r>
-              <w:rPr>
-                <w:b w:val="0"/>
-                <w:i w:val="0"/>
-                <w:sz w:val="18"/>
-              </w:rPr>
-              <w:t>0.9930620802</w:t>
-            </w:r>
-          </w:p>
-        </w:tc>
-        <w:tc>
-          <w:tcPr>
-            <w:tcW w:type="dxa" w:w="1218"/>
-          </w:tcPr>
-          <w:p>
-            <w:pPr>
-              <w:spacing w:after="40"/>
-            </w:pPr>
-            <w:r/>
-            <w:r>
-              <w:rPr>
-                <w:b w:val="0"/>
-                <w:i w:val="0"/>
-                <w:sz w:val="18"/>
-              </w:rPr>
-              <w:t>0.003909</w:t>
-            </w:r>
-          </w:p>
-        </w:tc>
-        <w:tc>
-          <w:tcPr>
-            <w:tcW w:type="dxa" w:w="1218"/>
-          </w:tcPr>
-          <w:p>
-            <w:pPr>
-              <w:spacing w:after="40"/>
-            </w:pPr>
-            <w:r/>
-            <w:r>
-              <w:rPr>
-                <w:b w:val="0"/>
-                <w:i w:val="0"/>
-                <w:sz w:val="18"/>
-              </w:rPr>
-              <w:t>0.003719</w:t>
-            </w:r>
-          </w:p>
-        </w:tc>
-        <w:tc>
-          <w:tcPr>
-            <w:tcW w:type="dxa" w:w="1218"/>
-          </w:tcPr>
-          <w:p>
-            <w:pPr>
-              <w:spacing w:after="40"/>
-            </w:pPr>
-            <w:r/>
-            <w:r>
-              <w:rPr>
-                <w:b w:val="0"/>
-                <w:i w:val="0"/>
-                <w:sz w:val="18"/>
-              </w:rPr>
-              <w:t>62.49</w:t>
-            </w:r>
-          </w:p>
-        </w:tc>
-      </w:tr>
-      <w:tr>
-        <w:tc>
-          <w:tcPr>
-            <w:tcW w:type="dxa" w:w="1218"/>
-          </w:tcPr>
-          <w:p>
-            <w:pPr>
-              <w:spacing w:after="40"/>
-            </w:pPr>
-            <w:r/>
-            <w:r>
-              <w:rPr>
-                <w:b w:val="0"/>
-                <w:i w:val="0"/>
-                <w:sz w:val="18"/>
-              </w:rPr>
-              <w:t>0.3050000</w:t>
-            </w:r>
-          </w:p>
-        </w:tc>
-        <w:tc>
-          <w:tcPr>
-            <w:tcW w:type="dxa" w:w="1218"/>
-          </w:tcPr>
-          <w:p>
-            <w:pPr>
-              <w:spacing w:after="40"/>
-            </w:pPr>
-            <w:r/>
-            <w:r>
-              <w:rPr>
-                <w:b w:val="0"/>
-                <w:i w:val="0"/>
-                <w:sz w:val="18"/>
-              </w:rPr>
-              <w:t>ordered</w:t>
-            </w:r>
-          </w:p>
-        </w:tc>
-        <w:tc>
-          <w:tcPr>
-            <w:tcW w:type="dxa" w:w="1218"/>
-          </w:tcPr>
-          <w:p>
-            <w:pPr>
-              <w:spacing w:after="40"/>
-            </w:pPr>
-            <w:r/>
-            <w:r>
-              <w:rPr>
-                <w:b w:val="0"/>
-                <w:i w:val="0"/>
-                <w:sz w:val="18"/>
-              </w:rPr>
-              <w:t>pending</w:t>
-            </w:r>
-          </w:p>
-        </w:tc>
-        <w:tc>
-          <w:tcPr>
-            <w:tcW w:type="dxa" w:w="1218"/>
-          </w:tcPr>
-          <w:p>
-            <w:pPr>
-              <w:spacing w:after="40"/>
-            </w:pPr>
-            <w:r/>
-            <w:r>
-              <w:rPr>
-                <w:b w:val="0"/>
-                <w:i w:val="0"/>
-                <w:sz w:val="18"/>
-              </w:rPr>
-              <w:t>—</w:t>
-            </w:r>
-          </w:p>
-        </w:tc>
-        <w:tc>
-          <w:tcPr>
-            <w:tcW w:type="dxa" w:w="1218"/>
-          </w:tcPr>
-          <w:p>
-            <w:pPr>
-              <w:spacing w:after="40"/>
-            </w:pPr>
-            <w:r/>
-            <w:r>
-              <w:rPr>
-                <w:b w:val="0"/>
-                <w:i w:val="0"/>
-                <w:sz w:val="18"/>
-              </w:rPr>
-              <w:t>—</w:t>
-            </w:r>
-          </w:p>
-        </w:tc>
-        <w:tc>
-          <w:tcPr>
-            <w:tcW w:type="dxa" w:w="1218"/>
-          </w:tcPr>
-          <w:p>
-            <w:pPr>
-              <w:spacing w:after="40"/>
-            </w:pPr>
-            <w:r/>
-            <w:r>
-              <w:rPr>
-                <w:b w:val="0"/>
-                <w:i w:val="0"/>
-                <w:sz w:val="18"/>
-              </w:rPr>
-              <w:t>—</w:t>
-            </w:r>
-          </w:p>
-        </w:tc>
-        <w:tc>
-          <w:tcPr>
-            <w:tcW w:type="dxa" w:w="1218"/>
-          </w:tcPr>
-          <w:p>
-            <w:pPr>
-              <w:spacing w:after="40"/>
-            </w:pPr>
-            <w:r/>
-            <w:r>
-              <w:rPr>
-                <w:b w:val="0"/>
-                <w:i w:val="0"/>
-                <w:sz w:val="18"/>
-              </w:rPr>
-              <w:t>—</w:t>
-            </w:r>
-          </w:p>
-        </w:tc>
-        <w:tc>
-          <w:tcPr>
-            <w:tcW w:type="dxa" w:w="1218"/>
-          </w:tcPr>
-          <w:p>
-            <w:pPr>
-              <w:spacing w:after="40"/>
-            </w:pPr>
-            <w:r/>
-            <w:r>
-              <w:rPr>
-                <w:b w:val="0"/>
-                <w:i w:val="0"/>
-                <w:sz w:val="18"/>
-              </w:rPr>
-              <w:t>—</w:t>
-            </w:r>
-          </w:p>
-        </w:tc>
-      </w:tr>
-      <w:tr>
-        <w:tc>
-          <w:tcPr>
-            <w:tcW w:type="dxa" w:w="1218"/>
-          </w:tcPr>
-          <w:p>
-            <w:pPr>
-              <w:spacing w:after="40"/>
-            </w:pPr>
-            <w:r/>
-            <w:r>
-              <w:rPr>
-                <w:b w:val="0"/>
-                <w:i w:val="0"/>
-                <w:sz w:val="18"/>
-              </w:rPr>
-              <w:t>0.3050000</w:t>
-            </w:r>
-          </w:p>
-        </w:tc>
-        <w:tc>
-          <w:tcPr>
-            <w:tcW w:type="dxa" w:w="1218"/>
-          </w:tcPr>
-          <w:p>
-            <w:pPr>
-              <w:spacing w:after="40"/>
-            </w:pPr>
-            <w:r/>
-            <w:r>
-              <w:rPr>
-                <w:b w:val="0"/>
-                <w:i w:val="0"/>
-                <w:sz w:val="18"/>
-              </w:rPr>
-              <w:t>disordered</w:t>
-            </w:r>
-          </w:p>
-        </w:tc>
-        <w:tc>
-          <w:tcPr>
-            <w:tcW w:type="dxa" w:w="1218"/>
-          </w:tcPr>
-          <w:p>
-            <w:pPr>
-              <w:spacing w:after="40"/>
-            </w:pPr>
-            <w:r/>
-            <w:r>
-              <w:rPr>
-                <w:b w:val="0"/>
-                <w:i w:val="0"/>
-                <w:sz w:val="18"/>
-              </w:rPr>
-              <w:t>pending</w:t>
-            </w:r>
-          </w:p>
-        </w:tc>
-        <w:tc>
-          <w:tcPr>
-            <w:tcW w:type="dxa" w:w="1218"/>
-          </w:tcPr>
-          <w:p>
-            <w:pPr>
-              <w:spacing w:after="40"/>
-            </w:pPr>
-            <w:r/>
-            <w:r>
-              <w:rPr>
-                <w:b w:val="0"/>
-                <w:i w:val="0"/>
-                <w:sz w:val="18"/>
-              </w:rPr>
-              <w:t>—</w:t>
-            </w:r>
-          </w:p>
-        </w:tc>
-        <w:tc>
-          <w:tcPr>
-            <w:tcW w:type="dxa" w:w="1218"/>
-          </w:tcPr>
-          <w:p>
-            <w:pPr>
-              <w:spacing w:after="40"/>
-            </w:pPr>
-            <w:r/>
-            <w:r>
-              <w:rPr>
-                <w:b w:val="0"/>
-                <w:i w:val="0"/>
-                <w:sz w:val="18"/>
-              </w:rPr>
-              <w:t>—</w:t>
-            </w:r>
-          </w:p>
-        </w:tc>
-        <w:tc>
-          <w:tcPr>
-            <w:tcW w:type="dxa" w:w="1218"/>
-          </w:tcPr>
-          <w:p>
-            <w:pPr>
-              <w:spacing w:after="40"/>
-            </w:pPr>
-            <w:r/>
-            <w:r>
-              <w:rPr>
-                <w:b w:val="0"/>
-                <w:i w:val="0"/>
-                <w:sz w:val="18"/>
-              </w:rPr>
-              <w:t>—</w:t>
-            </w:r>
-          </w:p>
-        </w:tc>
-        <w:tc>
-          <w:tcPr>
-            <w:tcW w:type="dxa" w:w="1218"/>
-          </w:tcPr>
-          <w:p>
-            <w:pPr>
-              <w:spacing w:after="40"/>
-            </w:pPr>
-            <w:r/>
-            <w:r>
-              <w:rPr>
-                <w:b w:val="0"/>
-                <w:i w:val="0"/>
-                <w:sz w:val="18"/>
-              </w:rPr>
-              <w:t>—</w:t>
-            </w:r>
-          </w:p>
-        </w:tc>
-        <w:tc>
-          <w:tcPr>
-            <w:tcW w:type="dxa" w:w="1218"/>
-          </w:tcPr>
-          <w:p>
-            <w:pPr>
-              <w:spacing w:after="40"/>
-            </w:pPr>
-            <w:r/>
-            <w:r>
-              <w:rPr>
-                <w:b w:val="0"/>
-                <w:i w:val="0"/>
-                <w:sz w:val="18"/>
-              </w:rPr>
-              <w:t>—</w:t>
-            </w:r>
-          </w:p>
-        </w:tc>
-      </w:tr>
-      <w:tr>
-        <w:tc>
-          <w:tcPr>
-            <w:tcW w:type="dxa" w:w="1218"/>
-          </w:tcPr>
-          <w:p>
-            <w:pPr>
-              <w:spacing w:after="40"/>
-            </w:pPr>
-            <w:r/>
-            <w:r>
-              <w:rPr>
-                <w:b w:val="0"/>
-                <w:i w:val="0"/>
-                <w:sz w:val="18"/>
-              </w:rPr>
-              <w:t>0.3055000</w:t>
-            </w:r>
-          </w:p>
-        </w:tc>
-        <w:tc>
-          <w:tcPr>
-            <w:tcW w:type="dxa" w:w="1218"/>
-          </w:tcPr>
-          <w:p>
-            <w:pPr>
-              <w:spacing w:after="40"/>
-            </w:pPr>
-            <w:r/>
-            <w:r>
-              <w:rPr>
-                <w:b w:val="0"/>
-                <w:i w:val="0"/>
-                <w:sz w:val="18"/>
-              </w:rPr>
-              <w:t>ordered</w:t>
-            </w:r>
-          </w:p>
-        </w:tc>
-        <w:tc>
-          <w:tcPr>
-            <w:tcW w:type="dxa" w:w="1218"/>
-          </w:tcPr>
-          <w:p>
-            <w:pPr>
-              <w:spacing w:after="40"/>
-            </w:pPr>
-            <w:r/>
-            <w:r>
-              <w:rPr>
-                <w:b w:val="0"/>
-                <w:i w:val="0"/>
-                <w:sz w:val="18"/>
-              </w:rPr>
-              <w:t>pending</w:t>
-            </w:r>
-          </w:p>
-        </w:tc>
-        <w:tc>
-          <w:tcPr>
-            <w:tcW w:type="dxa" w:w="1218"/>
-          </w:tcPr>
-          <w:p>
-            <w:pPr>
-              <w:spacing w:after="40"/>
-            </w:pPr>
-            <w:r/>
-            <w:r>
-              <w:rPr>
-                <w:b w:val="0"/>
-                <w:i w:val="0"/>
-                <w:sz w:val="18"/>
-              </w:rPr>
-              <w:t>—</w:t>
-            </w:r>
-          </w:p>
-        </w:tc>
-        <w:tc>
-          <w:tcPr>
-            <w:tcW w:type="dxa" w:w="1218"/>
-          </w:tcPr>
-          <w:p>
-            <w:pPr>
-              <w:spacing w:after="40"/>
-            </w:pPr>
-            <w:r/>
-            <w:r>
-              <w:rPr>
-                <w:b w:val="0"/>
-                <w:i w:val="0"/>
-                <w:sz w:val="18"/>
-              </w:rPr>
-              <w:t>—</w:t>
-            </w:r>
-          </w:p>
-        </w:tc>
-        <w:tc>
-          <w:tcPr>
-            <w:tcW w:type="dxa" w:w="1218"/>
-          </w:tcPr>
-          <w:p>
-            <w:pPr>
-              <w:spacing w:after="40"/>
-            </w:pPr>
-            <w:r/>
-            <w:r>
-              <w:rPr>
-                <w:b w:val="0"/>
-                <w:i w:val="0"/>
-                <w:sz w:val="18"/>
-              </w:rPr>
-              <w:t>—</w:t>
-            </w:r>
-          </w:p>
-        </w:tc>
-        <w:tc>
-          <w:tcPr>
-            <w:tcW w:type="dxa" w:w="1218"/>
-          </w:tcPr>
-          <w:p>
-            <w:pPr>
-              <w:spacing w:after="40"/>
-            </w:pPr>
-            <w:r/>
-            <w:r>
-              <w:rPr>
-                <w:b w:val="0"/>
-                <w:i w:val="0"/>
-                <w:sz w:val="18"/>
-              </w:rPr>
-              <w:t>—</w:t>
-            </w:r>
-          </w:p>
-        </w:tc>
-        <w:tc>
-          <w:tcPr>
-            <w:tcW w:type="dxa" w:w="1218"/>
-          </w:tcPr>
-          <w:p>
-            <w:pPr>
-              <w:spacing w:after="40"/>
-            </w:pPr>
-            <w:r/>
-            <w:r>
-              <w:rPr>
-                <w:b w:val="0"/>
-                <w:i w:val="0"/>
-                <w:sz w:val="18"/>
-              </w:rPr>
-              <w:t>—</w:t>
-            </w:r>
-          </w:p>
-        </w:tc>
-      </w:tr>
-      <w:tr>
-        <w:tc>
-          <w:tcPr>
-            <w:tcW w:type="dxa" w:w="1218"/>
-          </w:tcPr>
-          <w:p>
-            <w:pPr>
-              <w:spacing w:after="40"/>
-            </w:pPr>
-            <w:r/>
-            <w:r>
-              <w:rPr>
-                <w:b w:val="0"/>
-                <w:i w:val="0"/>
-                <w:sz w:val="18"/>
-              </w:rPr>
-              <w:t>0.3055000</w:t>
-            </w:r>
-          </w:p>
-        </w:tc>
-        <w:tc>
-          <w:tcPr>
-            <w:tcW w:type="dxa" w:w="1218"/>
-          </w:tcPr>
-          <w:p>
-            <w:pPr>
-              <w:spacing w:after="40"/>
-            </w:pPr>
-            <w:r/>
-            <w:r>
-              <w:rPr>
-                <w:b w:val="0"/>
-                <w:i w:val="0"/>
-                <w:sz w:val="18"/>
-              </w:rPr>
-              <w:t>disordered</w:t>
-            </w:r>
-          </w:p>
-        </w:tc>
-        <w:tc>
-          <w:tcPr>
-            <w:tcW w:type="dxa" w:w="1218"/>
-          </w:tcPr>
-          <w:p>
-            <w:pPr>
-              <w:spacing w:after="40"/>
-            </w:pPr>
-            <w:r/>
-            <w:r>
-              <w:rPr>
-                <w:b w:val="0"/>
-                <w:i w:val="0"/>
-                <w:sz w:val="18"/>
-              </w:rPr>
-              <w:t>pending</w:t>
-            </w:r>
-          </w:p>
-        </w:tc>
-        <w:tc>
-          <w:tcPr>
-            <w:tcW w:type="dxa" w:w="1218"/>
-          </w:tcPr>
-          <w:p>
-            <w:pPr>
-              <w:spacing w:after="40"/>
-            </w:pPr>
-            <w:r/>
-            <w:r>
-              <w:rPr>
-                <w:b w:val="0"/>
-                <w:i w:val="0"/>
-                <w:sz w:val="18"/>
-              </w:rPr>
-              <w:t>—</w:t>
-            </w:r>
-          </w:p>
-        </w:tc>
-        <w:tc>
-          <w:tcPr>
-            <w:tcW w:type="dxa" w:w="1218"/>
-          </w:tcPr>
-          <w:p>
-            <w:pPr>
-              <w:spacing w:after="40"/>
-            </w:pPr>
-            <w:r/>
-            <w:r>
-              <w:rPr>
-                <w:b w:val="0"/>
-                <w:i w:val="0"/>
-                <w:sz w:val="18"/>
-              </w:rPr>
-              <w:t>—</w:t>
-            </w:r>
-          </w:p>
-        </w:tc>
-        <w:tc>
-          <w:tcPr>
-            <w:tcW w:type="dxa" w:w="1218"/>
-          </w:tcPr>
-          <w:p>
-            <w:pPr>
-              <w:spacing w:after="40"/>
-            </w:pPr>
-            <w:r/>
-            <w:r>
-              <w:rPr>
-                <w:b w:val="0"/>
-                <w:i w:val="0"/>
-                <w:sz w:val="18"/>
-              </w:rPr>
-              <w:t>—</w:t>
-            </w:r>
-          </w:p>
-        </w:tc>
-        <w:tc>
-          <w:tcPr>
-            <w:tcW w:type="dxa" w:w="1218"/>
-          </w:tcPr>
-          <w:p>
-            <w:pPr>
-              <w:spacing w:after="40"/>
-            </w:pPr>
-            <w:r/>
-            <w:r>
-              <w:rPr>
-                <w:b w:val="0"/>
-                <w:i w:val="0"/>
-                <w:sz w:val="18"/>
-              </w:rPr>
-              <w:t>—</w:t>
-            </w:r>
-          </w:p>
-        </w:tc>
-        <w:tc>
-          <w:tcPr>
-            <w:tcW w:type="dxa" w:w="1218"/>
-          </w:tcPr>
-          <w:p>
-            <w:pPr>
-              <w:spacing w:after="40"/>
-            </w:pPr>
-            <w:r/>
-            <w:r>
-              <w:rPr>
-                <w:b w:val="0"/>
-                <w:i w:val="0"/>
-                <w:sz w:val="18"/>
+                <w:sz w:val="16"/>
               </w:rPr>
               <w:t>—</w:t>
             </w:r>
@@ -2225,16 +2737,25 @@
         <w:gridCol w:w="2436"/>
       </w:tblGrid>
       <w:tr>
+        <w:trPr>
+          <w:cantSplit/>
+          <w:tblHeader/>
+        </w:trPr>
         <w:tc>
           <w:tcPr>
             <w:tcW w:type="dxa" w:w="2436"/>
             <w:shd w:val="clear" w:color="auto" w:fill="E8ECF2"/>
+            <w:shd w:val="clear" w:color="auto" w:fill="E6EEF5"/>
           </w:tcPr>
           <w:p>
             <w:pPr>
               <w:spacing w:after="40"/>
             </w:pPr>
-            <w:r/>
+            <w:r>
+              <w:rPr>
+                <w:sz w:val="18"/>
+              </w:rPr>
+            </w:r>
             <w:r>
               <w:rPr>
                 <w:b/>
@@ -2249,12 +2770,17 @@
           <w:tcPr>
             <w:tcW w:type="dxa" w:w="2436"/>
             <w:shd w:val="clear" w:color="auto" w:fill="E8ECF2"/>
+            <w:shd w:val="clear" w:color="auto" w:fill="E6EEF5"/>
           </w:tcPr>
           <w:p>
             <w:pPr>
               <w:spacing w:after="40"/>
             </w:pPr>
-            <w:r/>
+            <w:r>
+              <w:rPr>
+                <w:sz w:val="18"/>
+              </w:rPr>
+            </w:r>
             <w:r>
               <w:rPr>
                 <w:b/>
@@ -2269,12 +2795,17 @@
           <w:tcPr>
             <w:tcW w:type="dxa" w:w="2436"/>
             <w:shd w:val="clear" w:color="auto" w:fill="E8ECF2"/>
+            <w:shd w:val="clear" w:color="auto" w:fill="E6EEF5"/>
           </w:tcPr>
           <w:p>
             <w:pPr>
               <w:spacing w:after="40"/>
             </w:pPr>
-            <w:r/>
+            <w:r>
+              <w:rPr>
+                <w:sz w:val="18"/>
+              </w:rPr>
+            </w:r>
             <w:r>
               <w:rPr>
                 <w:b/>
@@ -2289,12 +2820,17 @@
           <w:tcPr>
             <w:tcW w:type="dxa" w:w="2436"/>
             <w:shd w:val="clear" w:color="auto" w:fill="E8ECF2"/>
+            <w:shd w:val="clear" w:color="auto" w:fill="E6EEF5"/>
           </w:tcPr>
           <w:p>
             <w:pPr>
               <w:spacing w:after="40"/>
             </w:pPr>
-            <w:r/>
+            <w:r>
+              <w:rPr>
+                <w:sz w:val="18"/>
+              </w:rPr>
+            </w:r>
             <w:r>
               <w:rPr>
                 <w:b/>
@@ -2307,6 +2843,9 @@
         </w:tc>
       </w:tr>
       <w:tr>
+        <w:trPr>
+          <w:cantSplit/>
+        </w:trPr>
         <w:tc>
           <w:tcPr>
             <w:tcW w:type="dxa" w:w="2436"/>
@@ -2315,7 +2854,11 @@
             <w:pPr>
               <w:spacing w:after="40"/>
             </w:pPr>
-            <w:r/>
+            <w:r>
+              <w:rPr>
+                <w:sz w:val="18"/>
+              </w:rPr>
+            </w:r>
             <w:r>
               <w:rPr>
                 <w:b w:val="0"/>
@@ -2334,7 +2877,11 @@
             <w:pPr>
               <w:spacing w:after="40"/>
             </w:pPr>
-            <w:r/>
+            <w:r>
+              <w:rPr>
+                <w:sz w:val="18"/>
+              </w:rPr>
+            </w:r>
             <w:r>
               <w:rPr>
                 <w:b w:val="0"/>
@@ -2353,7 +2900,11 @@
             <w:pPr>
               <w:spacing w:after="40"/>
             </w:pPr>
-            <w:r/>
+            <w:r>
+              <w:rPr>
+                <w:sz w:val="18"/>
+              </w:rPr>
+            </w:r>
             <w:r>
               <w:rPr>
                 <w:b w:val="0"/>
@@ -2372,7 +2923,11 @@
             <w:pPr>
               <w:spacing w:after="40"/>
             </w:pPr>
-            <w:r/>
+            <w:r>
+              <w:rPr>
+                <w:sz w:val="18"/>
+              </w:rPr>
+            </w:r>
             <w:r>
               <w:rPr>
                 <w:b w:val="0"/>
@@ -2385,15 +2940,23 @@
         </w:tc>
       </w:tr>
       <w:tr>
+        <w:trPr>
+          <w:cantSplit/>
+        </w:trPr>
         <w:tc>
           <w:tcPr>
             <w:tcW w:type="dxa" w:w="2436"/>
+            <w:shd w:val="clear" w:color="auto" w:fill="F5F7FA"/>
           </w:tcPr>
           <w:p>
             <w:pPr>
               <w:spacing w:after="40"/>
             </w:pPr>
-            <w:r/>
+            <w:r>
+              <w:rPr>
+                <w:sz w:val="18"/>
+              </w:rPr>
+            </w:r>
             <w:r>
               <w:rPr>
                 <w:b w:val="0"/>
@@ -2407,12 +2970,314 @@
         <w:tc>
           <w:tcPr>
             <w:tcW w:type="dxa" w:w="2436"/>
+            <w:shd w:val="clear" w:color="auto" w:fill="F5F7FA"/>
           </w:tcPr>
           <w:p>
             <w:pPr>
               <w:spacing w:after="40"/>
             </w:pPr>
-            <w:r/>
+            <w:r>
+              <w:rPr>
+                <w:sz w:val="18"/>
+              </w:rPr>
+            </w:r>
+            <w:r>
+              <w:rPr>
+                <w:b w:val="0"/>
+                <w:i w:val="0"/>
+                <w:sz w:val="18"/>
+              </w:rPr>
+              <w:t>—</w:t>
+            </w:r>
+          </w:p>
+        </w:tc>
+        <w:tc>
+          <w:tcPr>
+            <w:tcW w:type="dxa" w:w="2436"/>
+            <w:shd w:val="clear" w:color="auto" w:fill="F5F7FA"/>
+          </w:tcPr>
+          <w:p>
+            <w:pPr>
+              <w:spacing w:after="40"/>
+            </w:pPr>
+            <w:r>
+              <w:rPr>
+                <w:sz w:val="18"/>
+              </w:rPr>
+            </w:r>
+            <w:r>
+              <w:rPr>
+                <w:b w:val="0"/>
+                <w:i w:val="0"/>
+                <w:sz w:val="18"/>
+              </w:rPr>
+              <w:t>—</w:t>
+            </w:r>
+          </w:p>
+        </w:tc>
+        <w:tc>
+          <w:tcPr>
+            <w:tcW w:type="dxa" w:w="2436"/>
+            <w:shd w:val="clear" w:color="auto" w:fill="F5F7FA"/>
+          </w:tcPr>
+          <w:p>
+            <w:pPr>
+              <w:spacing w:after="40"/>
+            </w:pPr>
+            <w:r>
+              <w:rPr>
+                <w:sz w:val="18"/>
+              </w:rPr>
+            </w:r>
+            <w:r>
+              <w:rPr>
+                <w:b w:val="0"/>
+                <w:i w:val="0"/>
+                <w:sz w:val="18"/>
+              </w:rPr>
+              <w:t>not applicable / pending</w:t>
+            </w:r>
+          </w:p>
+        </w:tc>
+      </w:tr>
+      <w:tr>
+        <w:trPr>
+          <w:cantSplit/>
+        </w:trPr>
+        <w:tc>
+          <w:tcPr>
+            <w:tcW w:type="dxa" w:w="2436"/>
+          </w:tcPr>
+          <w:p>
+            <w:pPr>
+              <w:spacing w:after="40"/>
+            </w:pPr>
+            <w:r>
+              <w:rPr>
+                <w:sz w:val="18"/>
+              </w:rPr>
+            </w:r>
+            <w:r>
+              <w:rPr>
+                <w:b w:val="0"/>
+                <w:i w:val="0"/>
+                <w:sz w:val="18"/>
+              </w:rPr>
+              <w:t>0.3047000</w:t>
+            </w:r>
+          </w:p>
+        </w:tc>
+        <w:tc>
+          <w:tcPr>
+            <w:tcW w:type="dxa" w:w="2436"/>
+          </w:tcPr>
+          <w:p>
+            <w:pPr>
+              <w:spacing w:after="40"/>
+            </w:pPr>
+            <w:r>
+              <w:rPr>
+                <w:sz w:val="18"/>
+              </w:rPr>
+            </w:r>
+            <w:r>
+              <w:rPr>
+                <w:b w:val="0"/>
+                <w:i w:val="0"/>
+                <w:sz w:val="18"/>
+              </w:rPr>
+              <w:t>-2.03e-13</w:t>
+            </w:r>
+          </w:p>
+        </w:tc>
+        <w:tc>
+          <w:tcPr>
+            <w:tcW w:type="dxa" w:w="2436"/>
+          </w:tcPr>
+          <w:p>
+            <w:pPr>
+              <w:spacing w:after="40"/>
+            </w:pPr>
+            <w:r>
+              <w:rPr>
+                <w:sz w:val="18"/>
+              </w:rPr>
+            </w:r>
+            <w:r>
+              <w:rPr>
+                <w:b w:val="0"/>
+                <w:i w:val="0"/>
+                <w:sz w:val="18"/>
+              </w:rPr>
+              <w:t>0.9999999989</w:t>
+            </w:r>
+          </w:p>
+        </w:tc>
+        <w:tc>
+          <w:tcPr>
+            <w:tcW w:type="dxa" w:w="2436"/>
+          </w:tcPr>
+          <w:p>
+            <w:pPr>
+              <w:spacing w:after="40"/>
+            </w:pPr>
+            <w:r>
+              <w:rPr>
+                <w:sz w:val="18"/>
+              </w:rPr>
+            </w:r>
+            <w:r>
+              <w:rPr>
+                <w:b w:val="0"/>
+                <w:i w:val="0"/>
+                <w:sz w:val="18"/>
+              </w:rPr>
+              <w:t>all 36 symmetry orientations evaluated</w:t>
+            </w:r>
+          </w:p>
+        </w:tc>
+      </w:tr>
+      <w:tr>
+        <w:trPr>
+          <w:cantSplit/>
+        </w:trPr>
+        <w:tc>
+          <w:tcPr>
+            <w:tcW w:type="dxa" w:w="2436"/>
+            <w:shd w:val="clear" w:color="auto" w:fill="F5F7FA"/>
+          </w:tcPr>
+          <w:p>
+            <w:pPr>
+              <w:spacing w:after="40"/>
+            </w:pPr>
+            <w:r>
+              <w:rPr>
+                <w:sz w:val="18"/>
+              </w:rPr>
+            </w:r>
+            <w:r>
+              <w:rPr>
+                <w:b w:val="0"/>
+                <w:i w:val="0"/>
+                <w:sz w:val="18"/>
+              </w:rPr>
+              <w:t>0.3048600</w:t>
+            </w:r>
+          </w:p>
+        </w:tc>
+        <w:tc>
+          <w:tcPr>
+            <w:tcW w:type="dxa" w:w="2436"/>
+            <w:shd w:val="clear" w:color="auto" w:fill="F5F7FA"/>
+          </w:tcPr>
+          <w:p>
+            <w:pPr>
+              <w:spacing w:after="40"/>
+            </w:pPr>
+            <w:r>
+              <w:rPr>
+                <w:sz w:val="18"/>
+              </w:rPr>
+            </w:r>
+            <w:r>
+              <w:rPr>
+                <w:b w:val="0"/>
+                <w:i w:val="0"/>
+                <w:sz w:val="18"/>
+              </w:rPr>
+              <w:t>3.76e-09</w:t>
+            </w:r>
+          </w:p>
+        </w:tc>
+        <w:tc>
+          <w:tcPr>
+            <w:tcW w:type="dxa" w:w="2436"/>
+            <w:shd w:val="clear" w:color="auto" w:fill="F5F7FA"/>
+          </w:tcPr>
+          <w:p>
+            <w:pPr>
+              <w:spacing w:after="40"/>
+            </w:pPr>
+            <w:r>
+              <w:rPr>
+                <w:sz w:val="18"/>
+              </w:rPr>
+            </w:r>
+            <w:r>
+              <w:rPr>
+                <w:b w:val="0"/>
+                <w:i w:val="0"/>
+                <w:sz w:val="18"/>
+              </w:rPr>
+              <w:t>0.9999994886</w:t>
+            </w:r>
+          </w:p>
+        </w:tc>
+        <w:tc>
+          <w:tcPr>
+            <w:tcW w:type="dxa" w:w="2436"/>
+            <w:shd w:val="clear" w:color="auto" w:fill="F5F7FA"/>
+          </w:tcPr>
+          <w:p>
+            <w:pPr>
+              <w:spacing w:after="40"/>
+            </w:pPr>
+            <w:r>
+              <w:rPr>
+                <w:sz w:val="18"/>
+              </w:rPr>
+            </w:r>
+            <w:r>
+              <w:rPr>
+                <w:b w:val="0"/>
+                <w:i w:val="0"/>
+                <w:sz w:val="18"/>
+              </w:rPr>
+              <w:t>all 36 symmetry orientations evaluated</w:t>
+            </w:r>
+          </w:p>
+        </w:tc>
+      </w:tr>
+      <w:tr>
+        <w:trPr>
+          <w:cantSplit/>
+        </w:trPr>
+        <w:tc>
+          <w:tcPr>
+            <w:tcW w:type="dxa" w:w="2436"/>
+          </w:tcPr>
+          <w:p>
+            <w:pPr>
+              <w:spacing w:after="40"/>
+            </w:pPr>
+            <w:r>
+              <w:rPr>
+                <w:sz w:val="18"/>
+              </w:rPr>
+            </w:r>
+            <w:r>
+              <w:rPr>
+                <w:b w:val="0"/>
+                <w:i w:val="0"/>
+                <w:sz w:val="18"/>
+              </w:rPr>
+              <w:t>0.3050000</w:t>
+            </w:r>
+          </w:p>
+        </w:tc>
+        <w:tc>
+          <w:tcPr>
+            <w:tcW w:type="dxa" w:w="2436"/>
+          </w:tcPr>
+          <w:p>
+            <w:pPr>
+              <w:spacing w:after="40"/>
+            </w:pPr>
+            <w:r>
+              <w:rPr>
+                <w:sz w:val="18"/>
+              </w:rPr>
+            </w:r>
             <w:r>
               <w:rPr>
                 <w:b w:val="0"/>
@@ -2431,7 +3296,11 @@
             <w:pPr>
               <w:spacing w:after="40"/>
             </w:pPr>
-            <w:r/>
+            <w:r>
+              <w:rPr>
+                <w:sz w:val="18"/>
+              </w:rPr>
+            </w:r>
             <w:r>
               <w:rPr>
                 <w:b w:val="0"/>
@@ -2450,7 +3319,11 @@
             <w:pPr>
               <w:spacing w:after="40"/>
             </w:pPr>
-            <w:r/>
+            <w:r>
+              <w:rPr>
+                <w:sz w:val="18"/>
+              </w:rPr>
+            </w:r>
             <w:r>
               <w:rPr>
                 <w:b w:val="0"/>
@@ -2463,34 +3336,47 @@
         </w:tc>
       </w:tr>
       <w:tr>
+        <w:trPr>
+          <w:cantSplit/>
+        </w:trPr>
         <w:tc>
           <w:tcPr>
             <w:tcW w:type="dxa" w:w="2436"/>
+            <w:shd w:val="clear" w:color="auto" w:fill="F5F7FA"/>
           </w:tcPr>
           <w:p>
             <w:pPr>
               <w:spacing w:after="40"/>
             </w:pPr>
-            <w:r/>
+            <w:r>
+              <w:rPr>
+                <w:sz w:val="18"/>
+              </w:rPr>
+            </w:r>
             <w:r>
               <w:rPr>
                 <w:b w:val="0"/>
                 <w:i w:val="0"/>
                 <w:sz w:val="18"/>
               </w:rPr>
-              <w:t>0.3047000</w:t>
+              <w:t>0.3055000</w:t>
             </w:r>
           </w:p>
         </w:tc>
         <w:tc>
           <w:tcPr>
             <w:tcW w:type="dxa" w:w="2436"/>
+            <w:shd w:val="clear" w:color="auto" w:fill="F5F7FA"/>
           </w:tcPr>
           <w:p>
             <w:pPr>
               <w:spacing w:after="40"/>
             </w:pPr>
-            <w:r/>
+            <w:r>
+              <w:rPr>
+                <w:sz w:val="18"/>
+              </w:rPr>
+            </w:r>
             <w:r>
               <w:rPr>
                 <w:b w:val="0"/>
@@ -2504,12 +3390,17 @@
         <w:tc>
           <w:tcPr>
             <w:tcW w:type="dxa" w:w="2436"/>
+            <w:shd w:val="clear" w:color="auto" w:fill="F5F7FA"/>
           </w:tcPr>
           <w:p>
             <w:pPr>
               <w:spacing w:after="40"/>
             </w:pPr>
-            <w:r/>
+            <w:r>
+              <w:rPr>
+                <w:sz w:val="18"/>
+              </w:rPr>
+            </w:r>
             <w:r>
               <w:rPr>
                 <w:b w:val="0"/>
@@ -2523,246 +3414,17 @@
         <w:tc>
           <w:tcPr>
             <w:tcW w:type="dxa" w:w="2436"/>
+            <w:shd w:val="clear" w:color="auto" w:fill="F5F7FA"/>
           </w:tcPr>
           <w:p>
             <w:pPr>
               <w:spacing w:after="40"/>
             </w:pPr>
-            <w:r/>
             <w:r>
               <w:rPr>
-                <w:b w:val="0"/>
-                <w:i w:val="0"/>
                 <w:sz w:val="18"/>
               </w:rPr>
-              <w:t>not applicable / pending</w:t>
             </w:r>
-          </w:p>
-        </w:tc>
-      </w:tr>
-      <w:tr>
-        <w:tc>
-          <w:tcPr>
-            <w:tcW w:type="dxa" w:w="2436"/>
-          </w:tcPr>
-          <w:p>
-            <w:pPr>
-              <w:spacing w:after="40"/>
-            </w:pPr>
-            <w:r/>
-            <w:r>
-              <w:rPr>
-                <w:b w:val="0"/>
-                <w:i w:val="0"/>
-                <w:sz w:val="18"/>
-              </w:rPr>
-              <w:t>0.3048600</w:t>
-            </w:r>
-          </w:p>
-        </w:tc>
-        <w:tc>
-          <w:tcPr>
-            <w:tcW w:type="dxa" w:w="2436"/>
-          </w:tcPr>
-          <w:p>
-            <w:pPr>
-              <w:spacing w:after="40"/>
-            </w:pPr>
-            <w:r/>
-            <w:r>
-              <w:rPr>
-                <w:b w:val="0"/>
-                <w:i w:val="0"/>
-                <w:sz w:val="18"/>
-              </w:rPr>
-              <w:t>3.76e-09</w:t>
-            </w:r>
-          </w:p>
-        </w:tc>
-        <w:tc>
-          <w:tcPr>
-            <w:tcW w:type="dxa" w:w="2436"/>
-          </w:tcPr>
-          <w:p>
-            <w:pPr>
-              <w:spacing w:after="40"/>
-            </w:pPr>
-            <w:r/>
-            <w:r>
-              <w:rPr>
-                <w:b w:val="0"/>
-                <w:i w:val="0"/>
-                <w:sz w:val="18"/>
-              </w:rPr>
-              <w:t>0.9999994886</w:t>
-            </w:r>
-          </w:p>
-        </w:tc>
-        <w:tc>
-          <w:tcPr>
-            <w:tcW w:type="dxa" w:w="2436"/>
-          </w:tcPr>
-          <w:p>
-            <w:pPr>
-              <w:spacing w:after="40"/>
-            </w:pPr>
-            <w:r/>
-            <w:r>
-              <w:rPr>
-                <w:b w:val="0"/>
-                <w:i w:val="0"/>
-                <w:sz w:val="18"/>
-              </w:rPr>
-              <w:t>all 36 symmetry orientations evaluated</w:t>
-            </w:r>
-          </w:p>
-        </w:tc>
-      </w:tr>
-      <w:tr>
-        <w:tc>
-          <w:tcPr>
-            <w:tcW w:type="dxa" w:w="2436"/>
-          </w:tcPr>
-          <w:p>
-            <w:pPr>
-              <w:spacing w:after="40"/>
-            </w:pPr>
-            <w:r/>
-            <w:r>
-              <w:rPr>
-                <w:b w:val="0"/>
-                <w:i w:val="0"/>
-                <w:sz w:val="18"/>
-              </w:rPr>
-              <w:t>0.3050000</w:t>
-            </w:r>
-          </w:p>
-        </w:tc>
-        <w:tc>
-          <w:tcPr>
-            <w:tcW w:type="dxa" w:w="2436"/>
-          </w:tcPr>
-          <w:p>
-            <w:pPr>
-              <w:spacing w:after="40"/>
-            </w:pPr>
-            <w:r/>
-            <w:r>
-              <w:rPr>
-                <w:b w:val="0"/>
-                <w:i w:val="0"/>
-                <w:sz w:val="18"/>
-              </w:rPr>
-              <w:t>—</w:t>
-            </w:r>
-          </w:p>
-        </w:tc>
-        <w:tc>
-          <w:tcPr>
-            <w:tcW w:type="dxa" w:w="2436"/>
-          </w:tcPr>
-          <w:p>
-            <w:pPr>
-              <w:spacing w:after="40"/>
-            </w:pPr>
-            <w:r/>
-            <w:r>
-              <w:rPr>
-                <w:b w:val="0"/>
-                <w:i w:val="0"/>
-                <w:sz w:val="18"/>
-              </w:rPr>
-              <w:t>—</w:t>
-            </w:r>
-          </w:p>
-        </w:tc>
-        <w:tc>
-          <w:tcPr>
-            <w:tcW w:type="dxa" w:w="2436"/>
-          </w:tcPr>
-          <w:p>
-            <w:pPr>
-              <w:spacing w:after="40"/>
-            </w:pPr>
-            <w:r/>
-            <w:r>
-              <w:rPr>
-                <w:b w:val="0"/>
-                <w:i w:val="0"/>
-                <w:sz w:val="18"/>
-              </w:rPr>
-              <w:t>not applicable / pending</w:t>
-            </w:r>
-          </w:p>
-        </w:tc>
-      </w:tr>
-      <w:tr>
-        <w:tc>
-          <w:tcPr>
-            <w:tcW w:type="dxa" w:w="2436"/>
-          </w:tcPr>
-          <w:p>
-            <w:pPr>
-              <w:spacing w:after="40"/>
-            </w:pPr>
-            <w:r/>
-            <w:r>
-              <w:rPr>
-                <w:b w:val="0"/>
-                <w:i w:val="0"/>
-                <w:sz w:val="18"/>
-              </w:rPr>
-              <w:t>0.3055000</w:t>
-            </w:r>
-          </w:p>
-        </w:tc>
-        <w:tc>
-          <w:tcPr>
-            <w:tcW w:type="dxa" w:w="2436"/>
-          </w:tcPr>
-          <w:p>
-            <w:pPr>
-              <w:spacing w:after="40"/>
-            </w:pPr>
-            <w:r/>
-            <w:r>
-              <w:rPr>
-                <w:b w:val="0"/>
-                <w:i w:val="0"/>
-                <w:sz w:val="18"/>
-              </w:rPr>
-              <w:t>—</w:t>
-            </w:r>
-          </w:p>
-        </w:tc>
-        <w:tc>
-          <w:tcPr>
-            <w:tcW w:type="dxa" w:w="2436"/>
-          </w:tcPr>
-          <w:p>
-            <w:pPr>
-              <w:spacing w:after="40"/>
-            </w:pPr>
-            <w:r/>
-            <w:r>
-              <w:rPr>
-                <w:b w:val="0"/>
-                <w:i w:val="0"/>
-                <w:sz w:val="18"/>
-              </w:rPr>
-              <w:t>—</w:t>
-            </w:r>
-          </w:p>
-        </w:tc>
-        <w:tc>
-          <w:tcPr>
-            <w:tcW w:type="dxa" w:w="2436"/>
-          </w:tcPr>
-          <w:p>
-            <w:pPr>
-              <w:spacing w:after="40"/>
-            </w:pPr>
-            <w:r/>
             <w:r>
               <w:rPr>
                 <w:b w:val="0"/>
@@ -2927,13 +3589,48 @@
       </w:r>
     </w:p>
     <w:sectPr>
-      <w:pgSz w:w="12240" w:h="15840"/>
-      <w:pgMar w:top="1134" w:right="1247" w:bottom="1134" w:left="1247" w:header="720" w:footer="720" w:gutter="0"/>
+      <w:headerReference w:type="default" r:id="rId9"/>
+      <w:footerReference w:type="default" r:id="rId10"/>
+      <w:pgSz w:w="11906" w:h="16838"/>
+      <w:pgMar w:top="1134" w:right="1020" w:bottom="1134" w:left="1020" w:header="720" w:footer="720" w:gutter="0"/>
       <w:cols w:space="720"/>
       <w:docGrid w:linePitch="360"/>
     </w:sectPr>
   </w:body>
 </w:document>
+</file>
+
+<file path=word/footer1.xml><?xml version="1.0" encoding="utf-8"?>
+<w:ftr xmlns:m="http://schemas.openxmlformats.org/officeDocument/2006/math" xmlns:mc="http://schemas.openxmlformats.org/markup-compatibility/2006" xmlns:mo="http://schemas.microsoft.com/office/mac/office/2008/main" xmlns:mv="urn:schemas-microsoft-com:mac:vml" xmlns:o="urn:schemas-microsoft-com:office:office" xmlns:r="http://schemas.openxmlformats.org/officeDocument/2006/relationships" xmlns:v="urn:schemas-microsoft-com:vml" xmlns:w10="urn:schemas-microsoft-com:office:word" xmlns:w14="http://schemas.microsoft.com/office/word/2010/wordml" xmlns:w="http://schemas.openxmlformats.org/wordprocessingml/2006/main" xmlns:wne="http://schemas.microsoft.com/office/word/2006/wordml" xmlns:wp14="http://schemas.microsoft.com/office/word/2010/wordprocessingDrawing" xmlns:wp="http://schemas.openxmlformats.org/drawingml/2006/wordprocessingDrawing" xmlns:wpc="http://schemas.microsoft.com/office/word/2010/wordprocessingCanvas" xmlns:wpg="http://schemas.microsoft.com/office/word/2010/wordprocessingGroup" xmlns:wpi="http://schemas.microsoft.com/office/word/2010/wordprocessingInk" xmlns:wps="http://schemas.microsoft.com/office/word/2010/wordprocessingShape" mc:Ignorable="w14 wp14">
+  <w:p>
+    <w:pPr>
+      <w:pStyle w:val="Footer"/>
+    </w:pPr>
+    <w:r>
+      <w:rPr>
+        <w:sz w:val="16"/>
+      </w:rPr>
+      <w:t xml:space="preserve">Author-review research / finite-χ observations / </w:t>
+    </w:r>
+    <w:fldSimple w:instr="PAGE"/>
+  </w:p>
+</w:ftr>
+</file>
+
+<file path=word/header1.xml><?xml version="1.0" encoding="utf-8"?>
+<w:hdr xmlns:m="http://schemas.openxmlformats.org/officeDocument/2006/math" xmlns:mc="http://schemas.openxmlformats.org/markup-compatibility/2006" xmlns:mo="http://schemas.microsoft.com/office/mac/office/2008/main" xmlns:mv="urn:schemas-microsoft-com:mac:vml" xmlns:o="urn:schemas-microsoft-com:office:office" xmlns:r="http://schemas.openxmlformats.org/officeDocument/2006/relationships" xmlns:v="urn:schemas-microsoft-com:vml" xmlns:w10="urn:schemas-microsoft-com:office:word" xmlns:w14="http://schemas.microsoft.com/office/word/2010/wordml" xmlns:w="http://schemas.openxmlformats.org/wordprocessingml/2006/main" xmlns:wne="http://schemas.microsoft.com/office/word/2006/wordml" xmlns:wp14="http://schemas.microsoft.com/office/word/2010/wordprocessingDrawing" xmlns:wp="http://schemas.openxmlformats.org/drawingml/2006/wordprocessingDrawing" xmlns:wpc="http://schemas.microsoft.com/office/word/2010/wordprocessingCanvas" xmlns:wpg="http://schemas.microsoft.com/office/word/2010/wordprocessingGroup" xmlns:wpi="http://schemas.microsoft.com/office/word/2010/wordprocessingInk" xmlns:wps="http://schemas.microsoft.com/office/word/2010/wordprocessingShape" mc:Ignorable="w14 wp14">
+  <w:p>
+    <w:pPr>
+      <w:pStyle w:val="Header"/>
+    </w:pPr>
+    <w:r>
+      <w:rPr>
+        <w:sz w:val="16"/>
+      </w:rPr>
+      <w:t>A-1 / χ128 FIXED-SOURCE RATE SCAN</w:t>
+    </w:r>
+  </w:p>
+</w:hdr>
 </file>
 
 <file path=word/numbering.xml><?xml version="1.0" encoding="utf-8"?>

</xml_diff>

<commit_message>
Record chi128 rate-scan progress: complete: all 12 preparation results accepted
</commit_message>
<xml_diff>
--- a/research/transition-order/chi128-scan-report.docx
+++ b/research/transition-order/chi128-scan-report.docx
@@ -3460,6 +3460,73 @@
           <w:b w:val="0"/>
           <w:i w:val="0"/>
         </w:rPr>
+        <w:t>Completed-grid finding</w:t>
+      </w:r>
+    </w:p>
+    <w:p>
+      <w:r>
+        <w:rPr>
+          <w:b w:val="0"/>
+          <w:i w:val="0"/>
+        </w:rPr>
+        <w:t>All 12 preparation results passed the declared gates (10 new targets plus 2 reused reference states). Both histories give large order diagnostics at .3040, .3045 and .3047, and small diagnostics at .30486, .3050 and .3055. After symmetry alignment, no persistent ordered/disordered branch separation was demonstrated at any of these six sampled rates.</w:t>
+      </w:r>
+    </w:p>
+    <w:p>
+      <w:r>
+        <w:rPr>
+          <w:b w:val="0"/>
+          <w:i w:val="0"/>
+        </w:rPr>
+        <w:t xml:space="preserve">The smallest best-aligned fidelity per site across the six comparisons is 0.9999994886. This supports numerical similarity, not exact state identity. The sampled large-to-small change lies between </w:t>
+      </w:r>
+      <w:r>
+        <w:rPr>
+          <w:b/>
+          <w:i w:val="0"/>
+        </w:rPr>
+        <w:t>.3047 and .30486 at this χ</w:t>
+      </w:r>
+      <w:r>
+        <w:rPr>
+          <w:b w:val="0"/>
+          <w:i w:val="0"/>
+        </w:rPr>
+        <w:t xml:space="preserve">. This is a finite-χ sampling interval, </w:t>
+      </w:r>
+      <w:r>
+        <w:rPr>
+          <w:b/>
+          <w:i w:val="0"/>
+        </w:rPr>
+        <w:t>not</w:t>
+      </w:r>
+      <w:r>
+        <w:rPr>
+          <w:b w:val="0"/>
+          <w:i w:val="0"/>
+        </w:rPr>
+        <w:t xml:space="preserve"> a thermodynamic critical-point confidence interval, a measured discontinuity, or proof of continuity.</w:t>
+      </w:r>
+    </w:p>
+    <w:p>
+      <w:r>
+        <w:rPr>
+          <w:b w:val="0"/>
+          <w:i w:val="0"/>
+        </w:rPr>
+        <w:t>A finer stationary-state rate bracket, followed by χ/size-systematic controls of any crossing and jump, is the next discriminating step. It is not automatically launched under this six-point allocation. χ192 remains gated.</w:t>
+      </w:r>
+    </w:p>
+    <w:p>
+      <w:pPr>
+        <w:pStyle w:val="Heading2"/>
+      </w:pPr>
+      <w:r>
+        <w:rPr>
+          <w:b w:val="0"/>
+          <w:i w:val="0"/>
+        </w:rPr>
         <w:t>What would count as coexistence evidence</w:t>
       </w:r>
     </w:p>

</xml_diff>